<commit_message>
Half RTL and documentation
</commit_message>
<xml_diff>
--- a/Documentation/CXS_Bridge_Architecture_Spec_cleaned.docx
+++ b/Documentation/CXS_Bridge_Architecture_Spec_cleaned.docx
@@ -4292,14 +4292,27 @@
         </w:rPr>
         <w:t xml:space="preserve">Figure </w:t>
       </w:r>
-      <w:fldSimple w:instr=" SEQ Figure \* ARABIC ">
-        <w:r>
-          <w:rPr>
-            <w:noProof/>
-          </w:rPr>
-          <w:t>1</w:t>
-        </w:r>
-      </w:fldSimple>
+      <w:r>
+        <w:fldChar w:fldCharType="begin"/>
+      </w:r>
+      <w:r>
+        <w:instrText xml:space="preserve"> SEQ Figure \* ARABIC </w:instrText>
+      </w:r>
+      <w:r>
+        <w:fldChar w:fldCharType="separate"/>
+      </w:r>
+      <w:r>
+        <w:rPr>
+          <w:noProof/>
+        </w:rPr>
+        <w:t>1</w:t>
+      </w:r>
+      <w:r>
+        <w:rPr>
+          <w:noProof/>
+        </w:rPr>
+        <w:fldChar w:fldCharType="end"/>
+      </w:r>
       <w:r>
         <w:rPr>
           <w:color w:val="2E74B5"/>
@@ -5322,14 +5335,27 @@
       <w:r>
         <w:t xml:space="preserve">Figure </w:t>
       </w:r>
-      <w:fldSimple w:instr=" SEQ Figure \* ARABIC ">
-        <w:r>
-          <w:rPr>
-            <w:noProof/>
-          </w:rPr>
-          <w:t>2</w:t>
-        </w:r>
-      </w:fldSimple>
+      <w:r>
+        <w:fldChar w:fldCharType="begin"/>
+      </w:r>
+      <w:r>
+        <w:instrText xml:space="preserve"> SEQ Figure \* ARABIC </w:instrText>
+      </w:r>
+      <w:r>
+        <w:fldChar w:fldCharType="separate"/>
+      </w:r>
+      <w:r>
+        <w:rPr>
+          <w:noProof/>
+        </w:rPr>
+        <w:t>2</w:t>
+      </w:r>
+      <w:r>
+        <w:rPr>
+          <w:noProof/>
+        </w:rPr>
+        <w:fldChar w:fldCharType="end"/>
+      </w:r>
       <w:r>
         <w:t xml:space="preserve"> - CXS Interface Wrapper (CXS_IF) architecture</w:t>
       </w:r>
@@ -6758,14 +6784,27 @@
       <w:r>
         <w:t xml:space="preserve">Figure </w:t>
       </w:r>
-      <w:fldSimple w:instr=" SEQ Figure \* ARABIC ">
-        <w:r>
-          <w:rPr>
-            <w:noProof/>
-          </w:rPr>
-          <w:t>3</w:t>
-        </w:r>
-      </w:fldSimple>
+      <w:r>
+        <w:fldChar w:fldCharType="begin"/>
+      </w:r>
+      <w:r>
+        <w:instrText xml:space="preserve"> SEQ Figure \* ARABIC </w:instrText>
+      </w:r>
+      <w:r>
+        <w:fldChar w:fldCharType="separate"/>
+      </w:r>
+      <w:r>
+        <w:rPr>
+          <w:noProof/>
+        </w:rPr>
+        <w:t>3</w:t>
+      </w:r>
+      <w:r>
+        <w:rPr>
+          <w:noProof/>
+        </w:rPr>
+        <w:fldChar w:fldCharType="end"/>
+      </w:r>
       <w:r>
         <w:t xml:space="preserve"> - RX Interface block diagram</w:t>
       </w:r>
@@ -8193,14 +8232,27 @@
       <w:r>
         <w:t xml:space="preserve">Figure </w:t>
       </w:r>
-      <w:fldSimple w:instr=" SEQ Figure \* ARABIC ">
-        <w:r>
-          <w:rPr>
-            <w:noProof/>
-          </w:rPr>
-          <w:t>4</w:t>
-        </w:r>
-      </w:fldSimple>
+      <w:r>
+        <w:fldChar w:fldCharType="begin"/>
+      </w:r>
+      <w:r>
+        <w:instrText xml:space="preserve"> SEQ Figure \* ARABIC </w:instrText>
+      </w:r>
+      <w:r>
+        <w:fldChar w:fldCharType="separate"/>
+      </w:r>
+      <w:r>
+        <w:rPr>
+          <w:noProof/>
+        </w:rPr>
+        <w:t>4</w:t>
+      </w:r>
+      <w:r>
+        <w:rPr>
+          <w:noProof/>
+        </w:rPr>
+        <w:fldChar w:fldCharType="end"/>
+      </w:r>
       <w:r>
         <w:t xml:space="preserve"> - FLIT FIFO block diagram</w:t>
       </w:r>
@@ -9734,45 +9786,31 @@
         <w:rPr>
           <w:b/>
           <w:bCs/>
+          <w:noProof/>
+          <w:sz w:val="24"/>
+          <w:szCs w:val="24"/>
         </w:rPr>
         <w:lastRenderedPageBreak/>
-        <w:t>3.3 Credit Manager</w:t>
-      </w:r>
-      <w:bookmarkEnd w:id="22"/>
-    </w:p>
-    <w:p>
-      <w:pPr>
-        <w:rPr>
-          <w:rFonts w:asciiTheme="majorBidi" w:hAnsiTheme="majorBidi" w:cstheme="majorBidi"/>
-          <w:sz w:val="24"/>
-          <w:szCs w:val="24"/>
-        </w:rPr>
-      </w:pPr>
-      <w:r>
-        <w:rPr>
-          <w:b/>
-          <w:bCs/>
-        </w:rPr>
-        <w:t>Purpose</w:t>
-      </w:r>
-    </w:p>
-    <w:p>
-      <w:pPr>
-        <w:framePr w:w="6973" w:h="0" w:hSpace="180" w:vSpace="120" w:wrap="around" w:vAnchor="text" w:hAnchor="margin" w:xAlign="center" w:y="1"/>
-        <w:jc w:val="center"/>
-      </w:pPr>
-      <w:r>
-        <w:rPr>
-          <w:b/>
-          <w:bCs/>
-          <w:noProof/>
-          <w:sz w:val="24"/>
-          <w:szCs w:val="24"/>
-        </w:rPr>
         <w:drawing>
-          <wp:inline distT="0" distB="0" distL="114300" distR="114300" wp14:anchorId="5293EB13" wp14:editId="0FAE2C0B">
+          <wp:anchor distT="0" distB="0" distL="114300" distR="114300" simplePos="0" relativeHeight="251658240" behindDoc="0" locked="0" layoutInCell="1" allowOverlap="1" wp14:anchorId="5293EB13" wp14:editId="1935B6F9">
+            <wp:simplePos x="0" y="0"/>
+            <wp:positionH relativeFrom="page">
+              <wp:align>left</wp:align>
+            </wp:positionH>
+            <wp:positionV relativeFrom="paragraph">
+              <wp:posOffset>199390</wp:posOffset>
+            </wp:positionV>
             <wp:extent cx="4351655" cy="3507105"/>
             <wp:effectExtent l="0" t="0" r="0" b="0"/>
+            <wp:wrapThrough wrapText="bothSides">
+              <wp:wrapPolygon edited="0">
+                <wp:start x="0" y="0"/>
+                <wp:lineTo x="0" y="21471"/>
+                <wp:lineTo x="21464" y="21471"/>
+                <wp:lineTo x="21464" y="0"/>
+                <wp:lineTo x="0" y="0"/>
+              </wp:wrapPolygon>
+            </wp:wrapThrough>
             <wp:docPr id="1369086829" name="Picture 11"/>
             <wp:cNvGraphicFramePr>
               <a:graphicFrameLocks xmlns:a="http://schemas.openxmlformats.org/drawingml/2006/main" noChangeAspect="1"/>
@@ -9820,32 +9858,33 @@
                 </pic:pic>
               </a:graphicData>
             </a:graphic>
-          </wp:inline>
+          </wp:anchor>
         </w:drawing>
       </w:r>
-    </w:p>
-    <w:p>
-      <w:pPr>
-        <w:pStyle w:val="Caption"/>
-        <w:framePr w:w="6973" w:h="0" w:hSpace="180" w:vSpace="120" w:wrap="around" w:vAnchor="text" w:hAnchor="margin" w:xAlign="center" w:y="1"/>
-        <w:jc w:val="center"/>
-      </w:pPr>
-      <w:bookmarkStart w:id="23" w:name="_Toc236515861"/>
-      <w:r>
-        <w:t xml:space="preserve">Figure </w:t>
-      </w:r>
-      <w:fldSimple w:instr=" SEQ Figure \* ARABIC ">
-        <w:r>
-          <w:rPr>
-            <w:noProof/>
-          </w:rPr>
-          <w:t>5</w:t>
-        </w:r>
-      </w:fldSimple>
-      <w:r>
-        <w:t xml:space="preserve"> - Credit Manager block diagram</w:t>
-      </w:r>
-      <w:bookmarkEnd w:id="23"/>
+      <w:r>
+        <w:rPr>
+          <w:b/>
+          <w:bCs/>
+        </w:rPr>
+        <w:t>3.3 Credit Manager</w:t>
+      </w:r>
+      <w:bookmarkEnd w:id="22"/>
+    </w:p>
+    <w:p>
+      <w:pPr>
+        <w:rPr>
+          <w:rFonts w:asciiTheme="majorBidi" w:hAnsiTheme="majorBidi" w:cstheme="majorBidi"/>
+          <w:sz w:val="24"/>
+          <w:szCs w:val="24"/>
+        </w:rPr>
+      </w:pPr>
+      <w:r>
+        <w:rPr>
+          <w:b/>
+          <w:bCs/>
+        </w:rPr>
+        <w:t>Purpose</w:t>
+      </w:r>
     </w:p>
     <w:p>
       <w:pPr>
@@ -9966,12 +10005,126 @@
     </w:p>
     <w:p>
       <w:pPr>
+        <w:rPr>
+          <w:rFonts w:asciiTheme="majorBidi" w:hAnsiTheme="majorBidi" w:cstheme="majorBidi"/>
+          <w:sz w:val="24"/>
+          <w:szCs w:val="24"/>
+        </w:rPr>
+      </w:pPr>
+    </w:p>
+    <w:p>
+      <w:pPr>
+        <w:rPr>
+          <w:rFonts w:asciiTheme="majorBidi" w:hAnsiTheme="majorBidi" w:cstheme="majorBidi"/>
+          <w:sz w:val="24"/>
+          <w:szCs w:val="24"/>
+        </w:rPr>
+      </w:pPr>
+    </w:p>
+    <w:p>
+      <w:pPr>
+        <w:framePr w:w="6973" w:h="0" w:hSpace="180" w:vSpace="120" w:wrap="around" w:vAnchor="text" w:hAnchor="page" w:x="133" w:y="648"/>
+        <w:jc w:val="center"/>
+      </w:pPr>
+    </w:p>
+    <w:p>
+      <w:pPr>
+        <w:pStyle w:val="Caption"/>
+        <w:framePr w:w="6973" w:h="0" w:hSpace="180" w:vSpace="120" w:wrap="around" w:vAnchor="text" w:hAnchor="page" w:x="133" w:y="648"/>
+        <w:jc w:val="center"/>
+      </w:pPr>
+      <w:bookmarkStart w:id="23" w:name="_Toc236515861"/>
+      <w:r>
+        <w:t xml:space="preserve">Figure </w:t>
+      </w:r>
+      <w:r>
+        <w:fldChar w:fldCharType="begin"/>
+      </w:r>
+      <w:r>
+        <w:instrText xml:space="preserve"> SEQ Figure \* ARABIC </w:instrText>
+      </w:r>
+      <w:r>
+        <w:fldChar w:fldCharType="separate"/>
+      </w:r>
+      <w:r>
+        <w:rPr>
+          <w:noProof/>
+        </w:rPr>
+        <w:t>5</w:t>
+      </w:r>
+      <w:r>
+        <w:rPr>
+          <w:noProof/>
+        </w:rPr>
+        <w:fldChar w:fldCharType="end"/>
+      </w:r>
+      <w:r>
+        <w:t xml:space="preserve"> - Credit Manager block diagram</w:t>
+      </w:r>
+      <w:bookmarkEnd w:id="23"/>
+    </w:p>
+    <w:p>
+      <w:pPr>
+        <w:rPr>
+          <w:rFonts w:asciiTheme="majorBidi" w:hAnsiTheme="majorBidi" w:cstheme="majorBidi"/>
+          <w:sz w:val="24"/>
+          <w:szCs w:val="24"/>
+        </w:rPr>
+      </w:pPr>
+    </w:p>
+    <w:p>
+      <w:pPr>
         <w:pStyle w:val="Heading3"/>
         <w:rPr>
-          <w:rFonts w:asciiTheme="majorBidi" w:hAnsiTheme="majorBidi" w:cstheme="majorBidi"/>
+          <w:b/>
+          <w:bCs/>
         </w:rPr>
       </w:pPr>
       <w:bookmarkStart w:id="24" w:name="_Toc236515834"/>
+    </w:p>
+    <w:p>
+      <w:pPr>
+        <w:pStyle w:val="Heading3"/>
+        <w:rPr>
+          <w:b/>
+          <w:bCs/>
+        </w:rPr>
+      </w:pPr>
+    </w:p>
+    <w:p>
+      <w:pPr>
+        <w:pStyle w:val="Heading3"/>
+        <w:rPr>
+          <w:b/>
+          <w:bCs/>
+        </w:rPr>
+      </w:pPr>
+    </w:p>
+    <w:p>
+      <w:pPr>
+        <w:pStyle w:val="Heading3"/>
+        <w:rPr>
+          <w:b/>
+          <w:bCs/>
+        </w:rPr>
+      </w:pPr>
+    </w:p>
+    <w:p>
+      <w:pPr>
+        <w:pStyle w:val="Heading3"/>
+        <w:rPr>
+          <w:b/>
+          <w:bCs/>
+        </w:rPr>
+      </w:pPr>
+    </w:p>
+    <w:p>
+      <w:pPr>
+        <w:pStyle w:val="Heading3"/>
+        <w:rPr>
+          <w:rFonts w:asciiTheme="majorBidi" w:hAnsiTheme="majorBidi" w:cstheme="majorBidi"/>
+        </w:rPr>
+      </w:pPr>
       <w:r>
         <w:rPr>
           <w:b/>
@@ -10957,6 +11110,7 @@
           <w:sz w:val="24"/>
           <w:szCs w:val="24"/>
         </w:rPr>
+        <w:lastRenderedPageBreak/>
         <w:t xml:space="preserve">Increments the counter whenever a FLIT is removed from the FIFO. </w:t>
       </w:r>
     </w:p>
@@ -11001,7 +11155,6 @@
           <w:sz w:val="24"/>
           <w:szCs w:val="24"/>
         </w:rPr>
-        <w:lastRenderedPageBreak/>
         <w:t xml:space="preserve">Prevents additional packet reception when no credits remain. </w:t>
       </w:r>
     </w:p>
@@ -11072,7 +11225,7 @@
           <w:szCs w:val="24"/>
         </w:rPr>
         <w:drawing>
-          <wp:inline distT="0" distB="0" distL="114300" distR="114300" wp14:anchorId="27DC6A4E" wp14:editId="4DE6F0AD">
+          <wp:inline distT="0" distB="0" distL="114300" distR="114300" wp14:anchorId="09A8C54A" wp14:editId="2AA57104">
             <wp:extent cx="2298700" cy="2710180"/>
             <wp:effectExtent l="0" t="0" r="6350" b="0"/>
             <wp:docPr id="631908928" name="Picture 11"/>
@@ -11136,14 +11289,27 @@
       <w:r>
         <w:t xml:space="preserve">Figure </w:t>
       </w:r>
-      <w:fldSimple w:instr=" SEQ Figure \* ARABIC ">
-        <w:r>
-          <w:rPr>
-            <w:noProof/>
-          </w:rPr>
-          <w:t>6</w:t>
-        </w:r>
-      </w:fldSimple>
+      <w:r>
+        <w:fldChar w:fldCharType="begin"/>
+      </w:r>
+      <w:r>
+        <w:instrText xml:space="preserve"> SEQ Figure \* ARABIC </w:instrText>
+      </w:r>
+      <w:r>
+        <w:fldChar w:fldCharType="separate"/>
+      </w:r>
+      <w:r>
+        <w:rPr>
+          <w:noProof/>
+        </w:rPr>
+        <w:t>6</w:t>
+      </w:r>
+      <w:r>
+        <w:rPr>
+          <w:noProof/>
+        </w:rPr>
+        <w:fldChar w:fldCharType="end"/>
+      </w:r>
       <w:r>
         <w:t xml:space="preserve"> - Packet Formatter block diagram</w:t>
       </w:r>
@@ -11160,7 +11326,31 @@
         <w:rPr>
           <w:rFonts w:asciiTheme="majorBidi" w:hAnsiTheme="majorBidi" w:cstheme="majorBidi"/>
         </w:rPr>
-        <w:t>The Packet Formatter reads FLITs from the FLIT FIFO and reconstructs complete packets for the internal bridge logic. It extracts the payload and control information from each FLIT and presents them as packet transactions.</w:t>
+        <w:t>The Packet Formatter reads FLITs from the FLIT FIFO and reconstructs complete packets for the internal bridge logic. It</w:t>
+      </w:r>
+      <w:r>
+        <w:rPr>
+          <w:rFonts w:asciiTheme="majorBidi" w:hAnsiTheme="majorBidi" w:cstheme="majorBidi"/>
+        </w:rPr>
+        <w:t xml:space="preserve"> first captures the flit from async fifo then </w:t>
+      </w:r>
+      <w:r>
+        <w:rPr>
+          <w:rFonts w:asciiTheme="majorBidi" w:hAnsiTheme="majorBidi" w:cstheme="majorBidi"/>
+        </w:rPr>
+        <w:t xml:space="preserve"> </w:t>
+      </w:r>
+      <w:r>
+        <w:rPr>
+          <w:rFonts w:asciiTheme="majorBidi" w:hAnsiTheme="majorBidi" w:cstheme="majorBidi"/>
+        </w:rPr>
+        <w:t xml:space="preserve">streams the packets sized according to async fifo in many consecutive clock cycles while also  using the captured control signal field from flit fifo so that it can determine </w:t>
+      </w:r>
+      <w:r>
+        <w:rPr>
+          <w:rFonts w:asciiTheme="majorBidi" w:hAnsiTheme="majorBidi" w:cstheme="majorBidi"/>
+        </w:rPr>
+        <w:t>what to send and when to stop.</w:t>
       </w:r>
     </w:p>
     <w:p>
@@ -11181,6 +11371,105 @@
           <v:rect id="_x0000_i1038" style="width:0;height:1.5pt" o:hralign="center" o:hrstd="t" o:hr="t" fillcolor="#a0a0a0" stroked="f"/>
         </w:pict>
       </w:r>
+    </w:p>
+    <w:p>
+      <w:pPr>
+        <w:rPr>
+          <w:rFonts w:asciiTheme="majorBidi" w:hAnsiTheme="majorBidi" w:cstheme="majorBidi"/>
+          <w:sz w:val="24"/>
+          <w:szCs w:val="24"/>
+        </w:rPr>
+      </w:pPr>
+    </w:p>
+    <w:p>
+      <w:pPr>
+        <w:rPr>
+          <w:rFonts w:asciiTheme="majorBidi" w:hAnsiTheme="majorBidi" w:cstheme="majorBidi"/>
+          <w:sz w:val="24"/>
+          <w:szCs w:val="24"/>
+        </w:rPr>
+      </w:pPr>
+    </w:p>
+    <w:p>
+      <w:pPr>
+        <w:rPr>
+          <w:rFonts w:asciiTheme="majorBidi" w:hAnsiTheme="majorBidi" w:cstheme="majorBidi"/>
+          <w:sz w:val="24"/>
+          <w:szCs w:val="24"/>
+        </w:rPr>
+      </w:pPr>
+    </w:p>
+    <w:p>
+      <w:pPr>
+        <w:rPr>
+          <w:rFonts w:asciiTheme="majorBidi" w:hAnsiTheme="majorBidi" w:cstheme="majorBidi"/>
+          <w:sz w:val="24"/>
+          <w:szCs w:val="24"/>
+        </w:rPr>
+      </w:pPr>
+    </w:p>
+    <w:p>
+      <w:pPr>
+        <w:rPr>
+          <w:rFonts w:asciiTheme="majorBidi" w:hAnsiTheme="majorBidi" w:cstheme="majorBidi"/>
+          <w:sz w:val="24"/>
+          <w:szCs w:val="24"/>
+        </w:rPr>
+      </w:pPr>
+    </w:p>
+    <w:p>
+      <w:pPr>
+        <w:rPr>
+          <w:rFonts w:asciiTheme="majorBidi" w:hAnsiTheme="majorBidi" w:cstheme="majorBidi"/>
+          <w:sz w:val="24"/>
+          <w:szCs w:val="24"/>
+        </w:rPr>
+      </w:pPr>
+    </w:p>
+    <w:p>
+      <w:pPr>
+        <w:rPr>
+          <w:rFonts w:asciiTheme="majorBidi" w:hAnsiTheme="majorBidi" w:cstheme="majorBidi"/>
+          <w:sz w:val="24"/>
+          <w:szCs w:val="24"/>
+        </w:rPr>
+      </w:pPr>
+    </w:p>
+    <w:p>
+      <w:pPr>
+        <w:rPr>
+          <w:rFonts w:asciiTheme="majorBidi" w:hAnsiTheme="majorBidi" w:cstheme="majorBidi"/>
+          <w:sz w:val="24"/>
+          <w:szCs w:val="24"/>
+        </w:rPr>
+      </w:pPr>
+    </w:p>
+    <w:p>
+      <w:pPr>
+        <w:rPr>
+          <w:rFonts w:asciiTheme="majorBidi" w:hAnsiTheme="majorBidi" w:cstheme="majorBidi"/>
+          <w:sz w:val="24"/>
+          <w:szCs w:val="24"/>
+        </w:rPr>
+      </w:pPr>
+    </w:p>
+    <w:p>
+      <w:pPr>
+        <w:rPr>
+          <w:rFonts w:asciiTheme="majorBidi" w:hAnsiTheme="majorBidi" w:cstheme="majorBidi"/>
+          <w:sz w:val="24"/>
+          <w:szCs w:val="24"/>
+        </w:rPr>
+      </w:pPr>
+    </w:p>
+    <w:p>
+      <w:pPr>
+        <w:rPr>
+          <w:rFonts w:asciiTheme="majorBidi" w:hAnsiTheme="majorBidi" w:cstheme="majorBidi"/>
+          <w:sz w:val="24"/>
+          <w:szCs w:val="24"/>
+        </w:rPr>
+      </w:pPr>
     </w:p>
     <w:p>
       <w:pPr>
@@ -11228,10 +11517,10 @@
         <w:tblLook w:val="04A0" w:firstRow="1" w:lastRow="0" w:firstColumn="1" w:lastColumn="0" w:noHBand="0" w:noVBand="1"/>
       </w:tblPr>
       <w:tblGrid>
-        <w:gridCol w:w="1567"/>
+        <w:gridCol w:w="1927"/>
         <w:gridCol w:w="757"/>
         <w:gridCol w:w="857"/>
-        <w:gridCol w:w="3712"/>
+        <w:gridCol w:w="3073"/>
       </w:tblGrid>
       <w:tr>
         <w:trPr>
@@ -11666,23 +11955,22 @@
           <w:tcPr>
             <w:tcW w:w="0" w:type="auto"/>
             <w:vAlign w:val="center"/>
-            <w:hideMark/>
-          </w:tcPr>
-          <w:p>
-            <w:pPr>
-              <w:rPr>
-                <w:rFonts w:asciiTheme="majorBidi" w:hAnsiTheme="majorBidi" w:cstheme="majorBidi"/>
-                <w:sz w:val="24"/>
-                <w:szCs w:val="24"/>
-              </w:rPr>
-            </w:pPr>
-            <w:r>
-              <w:rPr>
-                <w:rFonts w:asciiTheme="majorBidi" w:hAnsiTheme="majorBidi" w:cstheme="majorBidi"/>
-                <w:sz w:val="24"/>
-                <w:szCs w:val="24"/>
-              </w:rPr>
-              <w:t>flit_fifo_rd</w:t>
+          </w:tcPr>
+          <w:p>
+            <w:pPr>
+              <w:rPr>
+                <w:rFonts w:asciiTheme="majorBidi" w:hAnsiTheme="majorBidi" w:cstheme="majorBidi"/>
+                <w:sz w:val="24"/>
+                <w:szCs w:val="24"/>
+              </w:rPr>
+            </w:pPr>
+            <w:r>
+              <w:rPr>
+                <w:rFonts w:asciiTheme="majorBidi" w:hAnsiTheme="majorBidi" w:cstheme="majorBidi"/>
+                <w:sz w:val="24"/>
+                <w:szCs w:val="24"/>
+              </w:rPr>
+              <w:t>flit_fifo_rdata</w:t>
             </w:r>
           </w:p>
         </w:tc>
@@ -11690,23 +11978,22 @@
           <w:tcPr>
             <w:tcW w:w="0" w:type="auto"/>
             <w:vAlign w:val="center"/>
-            <w:hideMark/>
-          </w:tcPr>
-          <w:p>
-            <w:pPr>
-              <w:rPr>
-                <w:rFonts w:asciiTheme="majorBidi" w:hAnsiTheme="majorBidi" w:cstheme="majorBidi"/>
-                <w:sz w:val="24"/>
-                <w:szCs w:val="24"/>
-              </w:rPr>
-            </w:pPr>
-            <w:r>
-              <w:rPr>
-                <w:rFonts w:asciiTheme="majorBidi" w:hAnsiTheme="majorBidi" w:cstheme="majorBidi"/>
-                <w:sz w:val="24"/>
-                <w:szCs w:val="24"/>
-              </w:rPr>
-              <w:t>Output</w:t>
+          </w:tcPr>
+          <w:p>
+            <w:pPr>
+              <w:rPr>
+                <w:rFonts w:asciiTheme="majorBidi" w:hAnsiTheme="majorBidi" w:cstheme="majorBidi"/>
+                <w:sz w:val="24"/>
+                <w:szCs w:val="24"/>
+              </w:rPr>
+            </w:pPr>
+            <w:r>
+              <w:rPr>
+                <w:rFonts w:asciiTheme="majorBidi" w:hAnsiTheme="majorBidi" w:cstheme="majorBidi"/>
+                <w:sz w:val="24"/>
+                <w:szCs w:val="24"/>
+              </w:rPr>
+              <w:t>Input</w:t>
             </w:r>
           </w:p>
         </w:tc>
@@ -11714,23 +12001,22 @@
           <w:tcPr>
             <w:tcW w:w="0" w:type="auto"/>
             <w:vAlign w:val="center"/>
-            <w:hideMark/>
-          </w:tcPr>
-          <w:p>
-            <w:pPr>
-              <w:rPr>
-                <w:rFonts w:asciiTheme="majorBidi" w:hAnsiTheme="majorBidi" w:cstheme="majorBidi"/>
-                <w:sz w:val="24"/>
-                <w:szCs w:val="24"/>
-              </w:rPr>
-            </w:pPr>
-            <w:r>
-              <w:rPr>
-                <w:rFonts w:asciiTheme="majorBidi" w:hAnsiTheme="majorBidi" w:cstheme="majorBidi"/>
-                <w:sz w:val="24"/>
-                <w:szCs w:val="24"/>
-              </w:rPr>
-              <w:t>1 bit</w:t>
+          </w:tcPr>
+          <w:p>
+            <w:pPr>
+              <w:rPr>
+                <w:rFonts w:asciiTheme="majorBidi" w:hAnsiTheme="majorBidi" w:cstheme="majorBidi"/>
+                <w:sz w:val="24"/>
+                <w:szCs w:val="24"/>
+              </w:rPr>
+            </w:pPr>
+            <w:r>
+              <w:rPr>
+                <w:rFonts w:asciiTheme="majorBidi" w:hAnsiTheme="majorBidi" w:cstheme="majorBidi"/>
+                <w:sz w:val="24"/>
+                <w:szCs w:val="24"/>
+              </w:rPr>
+              <w:t>270 bits</w:t>
             </w:r>
           </w:p>
         </w:tc>
@@ -11738,23 +12024,22 @@
           <w:tcPr>
             <w:tcW w:w="0" w:type="auto"/>
             <w:vAlign w:val="center"/>
-            <w:hideMark/>
-          </w:tcPr>
-          <w:p>
-            <w:pPr>
-              <w:rPr>
-                <w:rFonts w:asciiTheme="majorBidi" w:hAnsiTheme="majorBidi" w:cstheme="majorBidi"/>
-                <w:sz w:val="24"/>
-                <w:szCs w:val="24"/>
-              </w:rPr>
-            </w:pPr>
-            <w:r>
-              <w:rPr>
-                <w:rFonts w:asciiTheme="majorBidi" w:hAnsiTheme="majorBidi" w:cstheme="majorBidi"/>
-                <w:sz w:val="24"/>
-                <w:szCs w:val="24"/>
-              </w:rPr>
-              <w:t>FIFO read enable</w:t>
+          </w:tcPr>
+          <w:p>
+            <w:pPr>
+              <w:rPr>
+                <w:rFonts w:asciiTheme="majorBidi" w:hAnsiTheme="majorBidi" w:cstheme="majorBidi"/>
+                <w:sz w:val="24"/>
+                <w:szCs w:val="24"/>
+              </w:rPr>
+            </w:pPr>
+            <w:r>
+              <w:rPr>
+                <w:rFonts w:asciiTheme="majorBidi" w:hAnsiTheme="majorBidi" w:cstheme="majorBidi"/>
+                <w:sz w:val="24"/>
+                <w:szCs w:val="24"/>
+              </w:rPr>
+              <w:t>FLIT read from FIFO</w:t>
             </w:r>
           </w:p>
         </w:tc>
@@ -11767,23 +12052,22 @@
           <w:tcPr>
             <w:tcW w:w="0" w:type="auto"/>
             <w:vAlign w:val="center"/>
-            <w:hideMark/>
-          </w:tcPr>
-          <w:p>
-            <w:pPr>
-              <w:rPr>
-                <w:rFonts w:asciiTheme="majorBidi" w:hAnsiTheme="majorBidi" w:cstheme="majorBidi"/>
-                <w:sz w:val="24"/>
-                <w:szCs w:val="24"/>
-              </w:rPr>
-            </w:pPr>
-            <w:r>
-              <w:rPr>
-                <w:rFonts w:asciiTheme="majorBidi" w:hAnsiTheme="majorBidi" w:cstheme="majorBidi"/>
-                <w:sz w:val="24"/>
-                <w:szCs w:val="24"/>
-              </w:rPr>
-              <w:t>flit_fifo_rdata</w:t>
+          </w:tcPr>
+          <w:p>
+            <w:pPr>
+              <w:rPr>
+                <w:rFonts w:asciiTheme="majorBidi" w:hAnsiTheme="majorBidi" w:cstheme="majorBidi"/>
+                <w:sz w:val="24"/>
+                <w:szCs w:val="24"/>
+              </w:rPr>
+            </w:pPr>
+            <w:r>
+              <w:rPr>
+                <w:rFonts w:asciiTheme="majorBidi" w:hAnsiTheme="majorBidi" w:cstheme="majorBidi"/>
+                <w:sz w:val="24"/>
+                <w:szCs w:val="24"/>
+              </w:rPr>
+              <w:t>async_fifo_full</w:t>
             </w:r>
           </w:p>
         </w:tc>
@@ -11791,7 +12075,6 @@
           <w:tcPr>
             <w:tcW w:w="0" w:type="auto"/>
             <w:vAlign w:val="center"/>
-            <w:hideMark/>
           </w:tcPr>
           <w:p>
             <w:pPr>
@@ -11815,23 +12098,22 @@
           <w:tcPr>
             <w:tcW w:w="0" w:type="auto"/>
             <w:vAlign w:val="center"/>
-            <w:hideMark/>
-          </w:tcPr>
-          <w:p>
-            <w:pPr>
-              <w:rPr>
-                <w:rFonts w:asciiTheme="majorBidi" w:hAnsiTheme="majorBidi" w:cstheme="majorBidi"/>
-                <w:sz w:val="24"/>
-                <w:szCs w:val="24"/>
-              </w:rPr>
-            </w:pPr>
-            <w:r>
-              <w:rPr>
-                <w:rFonts w:asciiTheme="majorBidi" w:hAnsiTheme="majorBidi" w:cstheme="majorBidi"/>
-                <w:sz w:val="24"/>
-                <w:szCs w:val="24"/>
-              </w:rPr>
-              <w:t>270 bits</w:t>
+          </w:tcPr>
+          <w:p>
+            <w:pPr>
+              <w:rPr>
+                <w:rFonts w:asciiTheme="majorBidi" w:hAnsiTheme="majorBidi" w:cstheme="majorBidi"/>
+                <w:sz w:val="24"/>
+                <w:szCs w:val="24"/>
+              </w:rPr>
+            </w:pPr>
+            <w:r>
+              <w:rPr>
+                <w:rFonts w:asciiTheme="majorBidi" w:hAnsiTheme="majorBidi" w:cstheme="majorBidi"/>
+                <w:sz w:val="24"/>
+                <w:szCs w:val="24"/>
+              </w:rPr>
+              <w:t xml:space="preserve">1 bit </w:t>
             </w:r>
           </w:p>
         </w:tc>
@@ -11839,23 +12121,22 @@
           <w:tcPr>
             <w:tcW w:w="0" w:type="auto"/>
             <w:vAlign w:val="center"/>
-            <w:hideMark/>
-          </w:tcPr>
-          <w:p>
-            <w:pPr>
-              <w:rPr>
-                <w:rFonts w:asciiTheme="majorBidi" w:hAnsiTheme="majorBidi" w:cstheme="majorBidi"/>
-                <w:sz w:val="24"/>
-                <w:szCs w:val="24"/>
-              </w:rPr>
-            </w:pPr>
-            <w:r>
-              <w:rPr>
-                <w:rFonts w:asciiTheme="majorBidi" w:hAnsiTheme="majorBidi" w:cstheme="majorBidi"/>
-                <w:sz w:val="24"/>
-                <w:szCs w:val="24"/>
-              </w:rPr>
-              <w:t>FLIT read from FIFO</w:t>
+          </w:tcPr>
+          <w:p>
+            <w:pPr>
+              <w:rPr>
+                <w:rFonts w:asciiTheme="majorBidi" w:hAnsiTheme="majorBidi" w:cstheme="majorBidi"/>
+                <w:sz w:val="24"/>
+                <w:szCs w:val="24"/>
+              </w:rPr>
+            </w:pPr>
+            <w:r>
+              <w:rPr>
+                <w:rFonts w:asciiTheme="majorBidi" w:hAnsiTheme="majorBidi" w:cstheme="majorBidi"/>
+                <w:sz w:val="24"/>
+                <w:szCs w:val="24"/>
+              </w:rPr>
+              <w:t>Indicates async fifo is full</w:t>
             </w:r>
           </w:p>
         </w:tc>
@@ -11884,7 +12165,7 @@
                 <w:sz w:val="24"/>
                 <w:szCs w:val="24"/>
               </w:rPr>
-              <w:t>packet_valid</w:t>
+              <w:t>flit_fifo_rd</w:t>
             </w:r>
           </w:p>
         </w:tc>
@@ -11956,7 +12237,7 @@
                 <w:sz w:val="24"/>
                 <w:szCs w:val="24"/>
               </w:rPr>
-              <w:t>Indicates a valid reconstructed packet</w:t>
+              <w:t>FIFO read enable</w:t>
             </w:r>
           </w:p>
         </w:tc>
@@ -11969,23 +12250,22 @@
           <w:tcPr>
             <w:tcW w:w="0" w:type="auto"/>
             <w:vAlign w:val="center"/>
-            <w:hideMark/>
-          </w:tcPr>
-          <w:p>
-            <w:pPr>
-              <w:rPr>
-                <w:rFonts w:asciiTheme="majorBidi" w:hAnsiTheme="majorBidi" w:cstheme="majorBidi"/>
-                <w:sz w:val="24"/>
-                <w:szCs w:val="24"/>
-              </w:rPr>
-            </w:pPr>
-            <w:r>
-              <w:rPr>
-                <w:rFonts w:asciiTheme="majorBidi" w:hAnsiTheme="majorBidi" w:cstheme="majorBidi"/>
-                <w:sz w:val="24"/>
-                <w:szCs w:val="24"/>
-              </w:rPr>
-              <w:t>packet_data</w:t>
+          </w:tcPr>
+          <w:p>
+            <w:pPr>
+              <w:rPr>
+                <w:rFonts w:asciiTheme="majorBidi" w:hAnsiTheme="majorBidi" w:cstheme="majorBidi"/>
+                <w:sz w:val="24"/>
+                <w:szCs w:val="24"/>
+              </w:rPr>
+            </w:pPr>
+            <w:r>
+              <w:rPr>
+                <w:rFonts w:asciiTheme="majorBidi" w:hAnsiTheme="majorBidi" w:cstheme="majorBidi"/>
+                <w:sz w:val="24"/>
+                <w:szCs w:val="24"/>
+              </w:rPr>
+              <w:t>async_fifo_w_en</w:t>
             </w:r>
           </w:p>
         </w:tc>
@@ -11993,7 +12273,6 @@
           <w:tcPr>
             <w:tcW w:w="0" w:type="auto"/>
             <w:vAlign w:val="center"/>
-            <w:hideMark/>
           </w:tcPr>
           <w:p>
             <w:pPr>
@@ -12017,23 +12296,22 @@
           <w:tcPr>
             <w:tcW w:w="0" w:type="auto"/>
             <w:vAlign w:val="center"/>
-            <w:hideMark/>
-          </w:tcPr>
-          <w:p>
-            <w:pPr>
-              <w:rPr>
-                <w:rFonts w:asciiTheme="majorBidi" w:hAnsiTheme="majorBidi" w:cstheme="majorBidi"/>
-                <w:sz w:val="24"/>
-                <w:szCs w:val="24"/>
-              </w:rPr>
-            </w:pPr>
-            <w:r>
-              <w:rPr>
-                <w:rFonts w:asciiTheme="majorBidi" w:hAnsiTheme="majorBidi" w:cstheme="majorBidi"/>
-                <w:sz w:val="24"/>
-                <w:szCs w:val="24"/>
-              </w:rPr>
-              <w:t>256 bits</w:t>
+          </w:tcPr>
+          <w:p>
+            <w:pPr>
+              <w:rPr>
+                <w:rFonts w:asciiTheme="majorBidi" w:hAnsiTheme="majorBidi" w:cstheme="majorBidi"/>
+                <w:sz w:val="24"/>
+                <w:szCs w:val="24"/>
+              </w:rPr>
+            </w:pPr>
+            <w:r>
+              <w:rPr>
+                <w:rFonts w:asciiTheme="majorBidi" w:hAnsiTheme="majorBidi" w:cstheme="majorBidi"/>
+                <w:sz w:val="24"/>
+                <w:szCs w:val="24"/>
+              </w:rPr>
+              <w:t>1 bit</w:t>
             </w:r>
           </w:p>
         </w:tc>
@@ -12041,23 +12319,22 @@
           <w:tcPr>
             <w:tcW w:w="0" w:type="auto"/>
             <w:vAlign w:val="center"/>
-            <w:hideMark/>
-          </w:tcPr>
-          <w:p>
-            <w:pPr>
-              <w:rPr>
-                <w:rFonts w:asciiTheme="majorBidi" w:hAnsiTheme="majorBidi" w:cstheme="majorBidi"/>
-                <w:sz w:val="24"/>
-                <w:szCs w:val="24"/>
-              </w:rPr>
-            </w:pPr>
-            <w:r>
-              <w:rPr>
-                <w:rFonts w:asciiTheme="majorBidi" w:hAnsiTheme="majorBidi" w:cstheme="majorBidi"/>
-                <w:sz w:val="24"/>
-                <w:szCs w:val="24"/>
-              </w:rPr>
-              <w:t>Packet payload</w:t>
+          </w:tcPr>
+          <w:p>
+            <w:pPr>
+              <w:rPr>
+                <w:rFonts w:asciiTheme="majorBidi" w:hAnsiTheme="majorBidi" w:cstheme="majorBidi"/>
+                <w:sz w:val="24"/>
+                <w:szCs w:val="24"/>
+              </w:rPr>
+            </w:pPr>
+            <w:r>
+              <w:rPr>
+                <w:rFonts w:asciiTheme="majorBidi" w:hAnsiTheme="majorBidi" w:cstheme="majorBidi"/>
+                <w:sz w:val="24"/>
+                <w:szCs w:val="24"/>
+              </w:rPr>
+              <w:t>Async fifo write enable</w:t>
             </w:r>
           </w:p>
         </w:tc>
@@ -12070,23 +12347,22 @@
           <w:tcPr>
             <w:tcW w:w="0" w:type="auto"/>
             <w:vAlign w:val="center"/>
-            <w:hideMark/>
-          </w:tcPr>
-          <w:p>
-            <w:pPr>
-              <w:rPr>
-                <w:rFonts w:asciiTheme="majorBidi" w:hAnsiTheme="majorBidi" w:cstheme="majorBidi"/>
-                <w:sz w:val="24"/>
-                <w:szCs w:val="24"/>
-              </w:rPr>
-            </w:pPr>
-            <w:r>
-              <w:rPr>
-                <w:rFonts w:asciiTheme="majorBidi" w:hAnsiTheme="majorBidi" w:cstheme="majorBidi"/>
-                <w:sz w:val="24"/>
-                <w:szCs w:val="24"/>
-              </w:rPr>
-              <w:t>packet_ctrl</w:t>
+          </w:tcPr>
+          <w:p>
+            <w:pPr>
+              <w:rPr>
+                <w:rFonts w:asciiTheme="majorBidi" w:hAnsiTheme="majorBidi" w:cstheme="majorBidi"/>
+                <w:sz w:val="24"/>
+                <w:szCs w:val="24"/>
+              </w:rPr>
+            </w:pPr>
+            <w:r>
+              <w:rPr>
+                <w:rFonts w:asciiTheme="majorBidi" w:hAnsiTheme="majorBidi" w:cstheme="majorBidi"/>
+                <w:sz w:val="24"/>
+                <w:szCs w:val="24"/>
+              </w:rPr>
+              <w:t>async_fifo_w_data</w:t>
             </w:r>
           </w:p>
         </w:tc>
@@ -12094,7 +12370,6 @@
           <w:tcPr>
             <w:tcW w:w="0" w:type="auto"/>
             <w:vAlign w:val="center"/>
-            <w:hideMark/>
           </w:tcPr>
           <w:p>
             <w:pPr>
@@ -12118,23 +12393,22 @@
           <w:tcPr>
             <w:tcW w:w="0" w:type="auto"/>
             <w:vAlign w:val="center"/>
-            <w:hideMark/>
-          </w:tcPr>
-          <w:p>
-            <w:pPr>
-              <w:rPr>
-                <w:rFonts w:asciiTheme="majorBidi" w:hAnsiTheme="majorBidi" w:cstheme="majorBidi"/>
-                <w:sz w:val="24"/>
-                <w:szCs w:val="24"/>
-              </w:rPr>
-            </w:pPr>
-            <w:r>
-              <w:rPr>
-                <w:rFonts w:asciiTheme="majorBidi" w:hAnsiTheme="majorBidi" w:cstheme="majorBidi"/>
-                <w:sz w:val="24"/>
-                <w:szCs w:val="24"/>
-              </w:rPr>
-              <w:t>14 bits</w:t>
+          </w:tcPr>
+          <w:p>
+            <w:pPr>
+              <w:rPr>
+                <w:rFonts w:asciiTheme="majorBidi" w:hAnsiTheme="majorBidi" w:cstheme="majorBidi"/>
+                <w:sz w:val="24"/>
+                <w:szCs w:val="24"/>
+              </w:rPr>
+            </w:pPr>
+            <w:r>
+              <w:rPr>
+                <w:rFonts w:asciiTheme="majorBidi" w:hAnsiTheme="majorBidi" w:cstheme="majorBidi"/>
+                <w:sz w:val="24"/>
+                <w:szCs w:val="24"/>
+              </w:rPr>
+              <w:t>32 bits</w:t>
             </w:r>
           </w:p>
         </w:tc>
@@ -12142,23 +12416,22 @@
           <w:tcPr>
             <w:tcW w:w="0" w:type="auto"/>
             <w:vAlign w:val="center"/>
-            <w:hideMark/>
-          </w:tcPr>
-          <w:p>
-            <w:pPr>
-              <w:rPr>
-                <w:rFonts w:asciiTheme="majorBidi" w:hAnsiTheme="majorBidi" w:cstheme="majorBidi"/>
-                <w:sz w:val="24"/>
-                <w:szCs w:val="24"/>
-              </w:rPr>
-            </w:pPr>
-            <w:r>
-              <w:rPr>
-                <w:rFonts w:asciiTheme="majorBidi" w:hAnsiTheme="majorBidi" w:cstheme="majorBidi"/>
-                <w:sz w:val="24"/>
-                <w:szCs w:val="24"/>
-              </w:rPr>
-              <w:t>Packet control information</w:t>
+          </w:tcPr>
+          <w:p>
+            <w:pPr>
+              <w:rPr>
+                <w:rFonts w:asciiTheme="majorBidi" w:hAnsiTheme="majorBidi" w:cstheme="majorBidi"/>
+                <w:sz w:val="24"/>
+                <w:szCs w:val="24"/>
+              </w:rPr>
+            </w:pPr>
+            <w:r>
+              <w:rPr>
+                <w:rFonts w:asciiTheme="majorBidi" w:hAnsiTheme="majorBidi" w:cstheme="majorBidi"/>
+                <w:sz w:val="24"/>
+                <w:szCs w:val="24"/>
+              </w:rPr>
+              <w:t>Streamed data to async fifo</w:t>
             </w:r>
           </w:p>
         </w:tc>
@@ -12408,14 +12681,27 @@
       <w:r>
         <w:t xml:space="preserve">Figure </w:t>
       </w:r>
-      <w:fldSimple w:instr=" SEQ Figure \* ARABIC ">
-        <w:r>
-          <w:rPr>
-            <w:noProof/>
-          </w:rPr>
-          <w:t>7</w:t>
-        </w:r>
-      </w:fldSimple>
+      <w:r>
+        <w:fldChar w:fldCharType="begin"/>
+      </w:r>
+      <w:r>
+        <w:instrText xml:space="preserve"> SEQ Figure \* ARABIC </w:instrText>
+      </w:r>
+      <w:r>
+        <w:fldChar w:fldCharType="separate"/>
+      </w:r>
+      <w:r>
+        <w:rPr>
+          <w:noProof/>
+        </w:rPr>
+        <w:t>7</w:t>
+      </w:r>
+      <w:r>
+        <w:rPr>
+          <w:noProof/>
+        </w:rPr>
+        <w:fldChar w:fldCharType="end"/>
+      </w:r>
       <w:r>
         <w:t xml:space="preserve"> - Packet Encoder block diagram</w:t>
       </w:r>
@@ -13534,14 +13820,27 @@
       <w:r>
         <w:t xml:space="preserve">Figure </w:t>
       </w:r>
-      <w:fldSimple w:instr=" SEQ Figure \* ARABIC ">
-        <w:r>
-          <w:rPr>
-            <w:noProof/>
-          </w:rPr>
-          <w:t>8</w:t>
-        </w:r>
-      </w:fldSimple>
+      <w:r>
+        <w:fldChar w:fldCharType="begin"/>
+      </w:r>
+      <w:r>
+        <w:instrText xml:space="preserve"> SEQ Figure \* ARABIC </w:instrText>
+      </w:r>
+      <w:r>
+        <w:fldChar w:fldCharType="separate"/>
+      </w:r>
+      <w:r>
+        <w:rPr>
+          <w:noProof/>
+        </w:rPr>
+        <w:t>8</w:t>
+      </w:r>
+      <w:r>
+        <w:rPr>
+          <w:noProof/>
+        </w:rPr>
+        <w:fldChar w:fldCharType="end"/>
+      </w:r>
       <w:r>
         <w:t xml:space="preserve"> - Asynchronous FIFO block diagram</w:t>
       </w:r>
@@ -16081,14 +16380,27 @@
       <w:r>
         <w:t xml:space="preserve">Figure </w:t>
       </w:r>
-      <w:fldSimple w:instr=" SEQ Figure \* ARABIC ">
-        <w:r>
-          <w:rPr>
-            <w:noProof/>
-          </w:rPr>
-          <w:t>9</w:t>
-        </w:r>
-      </w:fldSimple>
+      <w:r>
+        <w:fldChar w:fldCharType="begin"/>
+      </w:r>
+      <w:r>
+        <w:instrText xml:space="preserve"> SEQ Figure \* ARABIC </w:instrText>
+      </w:r>
+      <w:r>
+        <w:fldChar w:fldCharType="separate"/>
+      </w:r>
+      <w:r>
+        <w:rPr>
+          <w:noProof/>
+        </w:rPr>
+        <w:t>9</w:t>
+      </w:r>
+      <w:r>
+        <w:rPr>
+          <w:noProof/>
+        </w:rPr>
+        <w:fldChar w:fldCharType="end"/>
+      </w:r>
       <w:r>
         <w:t xml:space="preserve"> - Control Unit block diagram</w:t>
       </w:r>
@@ -18369,14 +18681,27 @@
       <w:r>
         <w:t xml:space="preserve">Figure </w:t>
       </w:r>
-      <w:fldSimple w:instr=" SEQ Figure \* ARABIC ">
-        <w:r>
-          <w:rPr>
-            <w:noProof/>
-          </w:rPr>
-          <w:t>10</w:t>
-        </w:r>
-      </w:fldSimple>
+      <w:r>
+        <w:fldChar w:fldCharType="begin"/>
+      </w:r>
+      <w:r>
+        <w:instrText xml:space="preserve"> SEQ Figure \* ARABIC </w:instrText>
+      </w:r>
+      <w:r>
+        <w:fldChar w:fldCharType="separate"/>
+      </w:r>
+      <w:r>
+        <w:rPr>
+          <w:noProof/>
+        </w:rPr>
+        <w:t>10</w:t>
+      </w:r>
+      <w:r>
+        <w:rPr>
+          <w:noProof/>
+        </w:rPr>
+        <w:fldChar w:fldCharType="end"/>
+      </w:r>
       <w:r>
         <w:t xml:space="preserve"> - Control Unit FSM state diagram</w:t>
       </w:r>
@@ -20830,14 +21155,27 @@
       <w:r>
         <w:t xml:space="preserve">Figure </w:t>
       </w:r>
-      <w:fldSimple w:instr=" SEQ Figure \* ARABIC ">
-        <w:r>
-          <w:rPr>
-            <w:noProof/>
-          </w:rPr>
-          <w:t>11</w:t>
-        </w:r>
-      </w:fldSimple>
+      <w:r>
+        <w:fldChar w:fldCharType="begin"/>
+      </w:r>
+      <w:r>
+        <w:instrText xml:space="preserve"> SEQ Figure \* ARABIC </w:instrText>
+      </w:r>
+      <w:r>
+        <w:fldChar w:fldCharType="separate"/>
+      </w:r>
+      <w:r>
+        <w:rPr>
+          <w:noProof/>
+        </w:rPr>
+        <w:t>11</w:t>
+      </w:r>
+      <w:r>
+        <w:rPr>
+          <w:noProof/>
+        </w:rPr>
+        <w:fldChar w:fldCharType="end"/>
+      </w:r>
       <w:r>
         <w:t xml:space="preserve"> - Encryption Module block diagram</w:t>
       </w:r>
@@ -22148,14 +22486,27 @@
       <w:r>
         <w:t xml:space="preserve">Figure </w:t>
       </w:r>
-      <w:fldSimple w:instr=" SEQ Figure \* ARABIC ">
-        <w:r>
-          <w:rPr>
-            <w:noProof/>
-          </w:rPr>
-          <w:t>12</w:t>
-        </w:r>
-      </w:fldSimple>
+      <w:r>
+        <w:fldChar w:fldCharType="begin"/>
+      </w:r>
+      <w:r>
+        <w:instrText xml:space="preserve"> SEQ Figure \* ARABIC </w:instrText>
+      </w:r>
+      <w:r>
+        <w:fldChar w:fldCharType="separate"/>
+      </w:r>
+      <w:r>
+        <w:rPr>
+          <w:noProof/>
+        </w:rPr>
+        <w:t>12</w:t>
+      </w:r>
+      <w:r>
+        <w:rPr>
+          <w:noProof/>
+        </w:rPr>
+        <w:fldChar w:fldCharType="end"/>
+      </w:r>
       <w:r>
         <w:t xml:space="preserve"> - Parity Module block diagram</w:t>
       </w:r>
@@ -23088,14 +23439,27 @@
       <w:r>
         <w:t xml:space="preserve">Figure </w:t>
       </w:r>
-      <w:fldSimple w:instr=" SEQ Figure \* ARABIC ">
-        <w:r>
-          <w:rPr>
-            <w:noProof/>
-          </w:rPr>
-          <w:t>13</w:t>
-        </w:r>
-      </w:fldSimple>
+      <w:r>
+        <w:fldChar w:fldCharType="begin"/>
+      </w:r>
+      <w:r>
+        <w:instrText xml:space="preserve"> SEQ Figure \* ARABIC </w:instrText>
+      </w:r>
+      <w:r>
+        <w:fldChar w:fldCharType="separate"/>
+      </w:r>
+      <w:r>
+        <w:rPr>
+          <w:noProof/>
+        </w:rPr>
+        <w:t>13</w:t>
+      </w:r>
+      <w:r>
+        <w:rPr>
+          <w:noProof/>
+        </w:rPr>
+        <w:fldChar w:fldCharType="end"/>
+      </w:r>
       <w:r>
         <w:t xml:space="preserve"> - Address Translation Unit (ATU) block diagram</w:t>
       </w:r>
@@ -24269,14 +24633,27 @@
       <w:r>
         <w:t xml:space="preserve">Figure </w:t>
       </w:r>
-      <w:fldSimple w:instr=" SEQ Figure \* ARABIC ">
-        <w:r>
-          <w:rPr>
-            <w:noProof/>
-          </w:rPr>
-          <w:t>14</w:t>
-        </w:r>
-      </w:fldSimple>
+      <w:r>
+        <w:fldChar w:fldCharType="begin"/>
+      </w:r>
+      <w:r>
+        <w:instrText xml:space="preserve"> SEQ Figure \* ARABIC </w:instrText>
+      </w:r>
+      <w:r>
+        <w:fldChar w:fldCharType="separate"/>
+      </w:r>
+      <w:r>
+        <w:rPr>
+          <w:noProof/>
+        </w:rPr>
+        <w:t>14</w:t>
+      </w:r>
+      <w:r>
+        <w:rPr>
+          <w:noProof/>
+        </w:rPr>
+        <w:fldChar w:fldCharType="end"/>
+      </w:r>
       <w:r>
         <w:t xml:space="preserve"> - Central Data Memory (CDM) block diagram</w:t>
       </w:r>

</xml_diff>

<commit_message>
RTL updated running first unit tests
</commit_message>
<xml_diff>
--- a/Documentation/CXS_Bridge_Architecture_Spec_cleaned.docx
+++ b/Documentation/CXS_Bridge_Architecture_Spec_cleaned.docx
@@ -6855,6 +6855,78 @@
     <w:p>
       <w:pPr>
         <w:rPr>
+          <w:b/>
+          <w:bCs/>
+        </w:rPr>
+      </w:pPr>
+    </w:p>
+    <w:p>
+      <w:pPr>
+        <w:rPr>
+          <w:b/>
+          <w:bCs/>
+        </w:rPr>
+      </w:pPr>
+    </w:p>
+    <w:p>
+      <w:pPr>
+        <w:rPr>
+          <w:b/>
+          <w:bCs/>
+        </w:rPr>
+      </w:pPr>
+    </w:p>
+    <w:p>
+      <w:pPr>
+        <w:rPr>
+          <w:b/>
+          <w:bCs/>
+        </w:rPr>
+      </w:pPr>
+    </w:p>
+    <w:p>
+      <w:pPr>
+        <w:rPr>
+          <w:b/>
+          <w:bCs/>
+        </w:rPr>
+      </w:pPr>
+    </w:p>
+    <w:p>
+      <w:pPr>
+        <w:rPr>
+          <w:b/>
+          <w:bCs/>
+        </w:rPr>
+      </w:pPr>
+    </w:p>
+    <w:p>
+      <w:pPr>
+        <w:rPr>
+          <w:b/>
+          <w:bCs/>
+        </w:rPr>
+      </w:pPr>
+    </w:p>
+    <w:p>
+      <w:pPr>
+        <w:rPr>
+          <w:b/>
+          <w:bCs/>
+        </w:rPr>
+      </w:pPr>
+    </w:p>
+    <w:p>
+      <w:pPr>
+        <w:rPr>
+          <w:b/>
+          <w:bCs/>
+        </w:rPr>
+      </w:pPr>
+    </w:p>
+    <w:p>
+      <w:pPr>
+        <w:rPr>
           <w:rFonts w:asciiTheme="majorBidi" w:hAnsiTheme="majorBidi" w:cstheme="majorBidi"/>
           <w:sz w:val="24"/>
           <w:szCs w:val="24"/>
@@ -8059,6 +8131,7 @@
           <w:sz w:val="24"/>
           <w:szCs w:val="24"/>
         </w:rPr>
+        <w:lastRenderedPageBreak/>
         <w:t xml:space="preserve">Prevents writes when the FIFO is full. </w:t>
       </w:r>
     </w:p>
@@ -8081,7 +8154,6 @@
           <w:sz w:val="24"/>
           <w:szCs w:val="24"/>
         </w:rPr>
-        <w:lastRenderedPageBreak/>
         <w:t xml:space="preserve">Generates FIFO write requests. </w:t>
       </w:r>
     </w:p>
@@ -8288,6 +8360,78 @@
     </w:p>
     <w:p>
       <w:pPr>
+        <w:pStyle w:val="NormalWeb"/>
+        <w:rPr>
+          <w:rFonts w:asciiTheme="majorBidi" w:hAnsiTheme="majorBidi" w:cstheme="majorBidi"/>
+        </w:rPr>
+      </w:pPr>
+    </w:p>
+    <w:p>
+      <w:pPr>
+        <w:pStyle w:val="NormalWeb"/>
+        <w:rPr>
+          <w:rFonts w:asciiTheme="majorBidi" w:hAnsiTheme="majorBidi" w:cstheme="majorBidi"/>
+        </w:rPr>
+      </w:pPr>
+    </w:p>
+    <w:p>
+      <w:pPr>
+        <w:pStyle w:val="NormalWeb"/>
+        <w:rPr>
+          <w:rFonts w:asciiTheme="majorBidi" w:hAnsiTheme="majorBidi" w:cstheme="majorBidi"/>
+        </w:rPr>
+      </w:pPr>
+    </w:p>
+    <w:p>
+      <w:pPr>
+        <w:pStyle w:val="NormalWeb"/>
+        <w:rPr>
+          <w:rFonts w:asciiTheme="majorBidi" w:hAnsiTheme="majorBidi" w:cstheme="majorBidi"/>
+        </w:rPr>
+      </w:pPr>
+    </w:p>
+    <w:p>
+      <w:pPr>
+        <w:pStyle w:val="NormalWeb"/>
+        <w:rPr>
+          <w:rFonts w:asciiTheme="majorBidi" w:hAnsiTheme="majorBidi" w:cstheme="majorBidi"/>
+        </w:rPr>
+      </w:pPr>
+    </w:p>
+    <w:p>
+      <w:pPr>
+        <w:pStyle w:val="NormalWeb"/>
+        <w:rPr>
+          <w:rFonts w:asciiTheme="majorBidi" w:hAnsiTheme="majorBidi" w:cstheme="majorBidi"/>
+        </w:rPr>
+      </w:pPr>
+    </w:p>
+    <w:p>
+      <w:pPr>
+        <w:pStyle w:val="NormalWeb"/>
+        <w:rPr>
+          <w:rFonts w:asciiTheme="majorBidi" w:hAnsiTheme="majorBidi" w:cstheme="majorBidi"/>
+        </w:rPr>
+      </w:pPr>
+    </w:p>
+    <w:p>
+      <w:pPr>
+        <w:pStyle w:val="NormalWeb"/>
+        <w:rPr>
+          <w:rFonts w:asciiTheme="majorBidi" w:hAnsiTheme="majorBidi" w:cstheme="majorBidi"/>
+        </w:rPr>
+      </w:pPr>
+    </w:p>
+    <w:p>
+      <w:pPr>
+        <w:pStyle w:val="NormalWeb"/>
+        <w:rPr>
+          <w:rFonts w:asciiTheme="majorBidi" w:hAnsiTheme="majorBidi" w:cstheme="majorBidi"/>
+        </w:rPr>
+      </w:pPr>
+    </w:p>
+    <w:p>
+      <w:pPr>
         <w:rPr>
           <w:rFonts w:asciiTheme="majorBidi" w:hAnsiTheme="majorBidi" w:cstheme="majorBidi"/>
           <w:sz w:val="24"/>
@@ -9755,6 +9899,7 @@
           <w:sz w:val="24"/>
           <w:szCs w:val="24"/>
         </w:rPr>
+        <w:lastRenderedPageBreak/>
         <w:t xml:space="preserve">Generates Full and Empty status signals. </w:t>
       </w:r>
     </w:p>
@@ -9790,7 +9935,6 @@
           <w:sz w:val="24"/>
           <w:szCs w:val="24"/>
         </w:rPr>
-        <w:lastRenderedPageBreak/>
         <w:drawing>
           <wp:anchor distT="0" distB="0" distL="114300" distR="114300" simplePos="0" relativeHeight="251658240" behindDoc="0" locked="0" layoutInCell="1" allowOverlap="1" wp14:anchorId="5293EB13" wp14:editId="1935B6F9">
             <wp:simplePos x="0" y="0"/>
@@ -11043,6 +11187,8 @@
         <w:rPr>
           <w:b/>
           <w:bCs/>
+          <w:sz w:val="24"/>
+          <w:szCs w:val="24"/>
         </w:rPr>
         <w:t>Responsibilities</w:t>
       </w:r>
@@ -11066,6 +11212,7 @@
           <w:sz w:val="24"/>
           <w:szCs w:val="24"/>
         </w:rPr>
+        <w:lastRenderedPageBreak/>
         <w:t xml:space="preserve">Tracks available receive credits. </w:t>
       </w:r>
     </w:p>
@@ -11110,7 +11257,6 @@
           <w:sz w:val="24"/>
           <w:szCs w:val="24"/>
         </w:rPr>
-        <w:lastRenderedPageBreak/>
         <w:t xml:space="preserve">Increments the counter whenever a FLIT is removed from the FIFO. </w:t>
       </w:r>
     </w:p>
@@ -12569,6 +12715,8 @@
         <w:spacing w:before="100" w:beforeAutospacing="1" w:after="100" w:afterAutospacing="1"/>
         <w:rPr>
           <w:rFonts w:asciiTheme="majorBidi" w:hAnsiTheme="majorBidi" w:cstheme="majorBidi"/>
+          <w:b/>
+          <w:bCs/>
           <w:sz w:val="24"/>
           <w:szCs w:val="24"/>
         </w:rPr>
@@ -12581,21 +12729,1906 @@
         </w:rPr>
         <w:t xml:space="preserve">Generates valid packet outputs for downstream processing. </w:t>
       </w:r>
-    </w:p>
-    <w:p>
-      <w:pPr>
-        <w:rPr>
-          <w:rFonts w:asciiTheme="majorBidi" w:hAnsiTheme="majorBidi" w:cstheme="majorBidi"/>
-          <w:sz w:val="24"/>
-          <w:szCs w:val="24"/>
-        </w:rPr>
-      </w:pPr>
-      <w:r>
-        <w:rPr>
-          <w:rFonts w:asciiTheme="majorBidi" w:hAnsiTheme="majorBidi" w:cstheme="majorBidi"/>
-          <w:sz w:val="24"/>
-          <w:szCs w:val="24"/>
-        </w:rPr>
+      <w:r>
+        <w:rPr>
+          <w:rFonts w:asciiTheme="majorBidi" w:hAnsiTheme="majorBidi" w:cstheme="majorBidi"/>
+          <w:sz w:val="24"/>
+          <w:szCs w:val="24"/>
+        </w:rPr>
+        <w:br/>
+      </w:r>
+    </w:p>
+    <w:p>
+      <w:pPr>
+        <w:spacing w:before="100" w:beforeAutospacing="1" w:after="100" w:afterAutospacing="1"/>
+        <w:ind w:left="360"/>
+        <w:rPr>
+          <w:rFonts w:asciiTheme="majorBidi" w:hAnsiTheme="majorBidi" w:cstheme="majorBidi"/>
+          <w:b/>
+          <w:bCs/>
+          <w:sz w:val="24"/>
+          <w:szCs w:val="24"/>
+        </w:rPr>
+      </w:pPr>
+    </w:p>
+    <w:p>
+      <w:pPr>
+        <w:spacing w:before="100" w:beforeAutospacing="1" w:after="100" w:afterAutospacing="1"/>
+        <w:ind w:left="360"/>
+        <w:rPr>
+          <w:rFonts w:asciiTheme="majorBidi" w:hAnsiTheme="majorBidi" w:cstheme="majorBidi"/>
+          <w:b/>
+          <w:bCs/>
+          <w:sz w:val="24"/>
+          <w:szCs w:val="24"/>
+        </w:rPr>
+      </w:pPr>
+    </w:p>
+    <w:p>
+      <w:pPr>
+        <w:spacing w:before="100" w:beforeAutospacing="1" w:after="100" w:afterAutospacing="1"/>
+        <w:rPr>
+          <w:rFonts w:asciiTheme="majorBidi" w:hAnsiTheme="majorBidi" w:cstheme="majorBidi"/>
+          <w:b/>
+          <w:bCs/>
+          <w:sz w:val="24"/>
+          <w:szCs w:val="24"/>
+        </w:rPr>
+      </w:pPr>
+    </w:p>
+    <w:p>
+      <w:pPr>
+        <w:spacing w:before="100" w:beforeAutospacing="1" w:after="100" w:afterAutospacing="1"/>
+        <w:ind w:left="360"/>
+        <w:rPr>
+          <w:rFonts w:asciiTheme="majorBidi" w:hAnsiTheme="majorBidi" w:cstheme="majorBidi"/>
+          <w:b/>
+          <w:bCs/>
+          <w:sz w:val="24"/>
+          <w:szCs w:val="24"/>
+        </w:rPr>
+      </w:pPr>
+      <w:r>
+        <w:rPr>
+          <w:rFonts w:asciiTheme="majorBidi" w:hAnsiTheme="majorBidi" w:cstheme="majorBidi"/>
+          <w:b/>
+          <w:bCs/>
+          <w:sz w:val="24"/>
+          <w:szCs w:val="24"/>
+        </w:rPr>
+        <w:t>Packet control fields</w:t>
+      </w:r>
+    </w:p>
+    <w:p>
+      <w:pPr>
+        <w:spacing w:before="100" w:beforeAutospacing="1" w:after="100" w:afterAutospacing="1"/>
+        <w:ind w:left="360"/>
+        <w:rPr>
+          <w:rFonts w:asciiTheme="majorBidi" w:hAnsiTheme="majorBidi" w:cstheme="majorBidi"/>
+          <w:sz w:val="24"/>
+          <w:szCs w:val="24"/>
+        </w:rPr>
+      </w:pPr>
+      <w:r>
+        <w:rPr>
+          <w:rFonts w:asciiTheme="majorBidi" w:hAnsiTheme="majorBidi" w:cstheme="majorBidi"/>
+          <w:sz w:val="24"/>
+          <w:szCs w:val="24"/>
+        </w:rPr>
+        <w:t xml:space="preserve">The </w:t>
+      </w:r>
+      <w:r>
+        <w:rPr>
+          <w:rFonts w:asciiTheme="majorBidi" w:hAnsiTheme="majorBidi" w:cstheme="majorBidi"/>
+          <w:b/>
+          <w:bCs/>
+          <w:sz w:val="24"/>
+          <w:szCs w:val="24"/>
+        </w:rPr>
+        <w:t xml:space="preserve">CXSCNTL </w:t>
+      </w:r>
+      <w:r>
+        <w:rPr>
+          <w:rFonts w:asciiTheme="majorBidi" w:hAnsiTheme="majorBidi" w:cstheme="majorBidi"/>
+          <w:sz w:val="24"/>
+          <w:szCs w:val="24"/>
+        </w:rPr>
+        <w:t>signal contains five fields. The widths of each field, and therefore the bit position of each field,</w:t>
+      </w:r>
+      <w:r>
+        <w:rPr>
+          <w:rFonts w:asciiTheme="majorBidi" w:hAnsiTheme="majorBidi" w:cstheme="majorBidi"/>
+          <w:sz w:val="24"/>
+          <w:szCs w:val="24"/>
+        </w:rPr>
+        <w:t xml:space="preserve"> </w:t>
+      </w:r>
+      <w:r>
+        <w:rPr>
+          <w:rFonts w:asciiTheme="majorBidi" w:hAnsiTheme="majorBidi" w:cstheme="majorBidi"/>
+          <w:sz w:val="24"/>
+          <w:szCs w:val="24"/>
+        </w:rPr>
+        <w:t xml:space="preserve">vary with the properties of the interface. </w:t>
+      </w:r>
+    </w:p>
+    <w:p>
+      <w:pPr>
+        <w:spacing w:before="100" w:beforeAutospacing="1" w:after="100" w:afterAutospacing="1"/>
+        <w:rPr>
+          <w:rFonts w:asciiTheme="majorBidi" w:hAnsiTheme="majorBidi" w:cstheme="majorBidi"/>
+          <w:b/>
+          <w:bCs/>
+          <w:sz w:val="24"/>
+          <w:szCs w:val="24"/>
+        </w:rPr>
+      </w:pPr>
+      <w:r>
+        <w:rPr>
+          <w:rFonts w:asciiTheme="majorBidi" w:hAnsiTheme="majorBidi" w:cstheme="majorBidi"/>
+          <w:b/>
+          <w:bCs/>
+          <w:sz w:val="24"/>
+          <w:szCs w:val="24"/>
+        </w:rPr>
+        <w:t xml:space="preserve">      </w:t>
+      </w:r>
+      <w:r>
+        <w:rPr>
+          <w:rFonts w:asciiTheme="majorBidi" w:hAnsiTheme="majorBidi" w:cstheme="majorBidi"/>
+          <w:b/>
+          <w:bCs/>
+          <w:sz w:val="24"/>
+          <w:szCs w:val="24"/>
+        </w:rPr>
+        <w:t>Field Description</w:t>
+      </w:r>
+    </w:p>
+    <w:p>
+      <w:pPr>
+        <w:spacing w:before="100" w:beforeAutospacing="1" w:after="100" w:afterAutospacing="1"/>
+        <w:ind w:left="360"/>
+        <w:rPr>
+          <w:rFonts w:asciiTheme="majorBidi" w:hAnsiTheme="majorBidi" w:cstheme="majorBidi"/>
+          <w:sz w:val="24"/>
+          <w:szCs w:val="24"/>
+        </w:rPr>
+      </w:pPr>
+      <w:r>
+        <w:rPr>
+          <w:rFonts w:asciiTheme="majorBidi" w:hAnsiTheme="majorBidi" w:cstheme="majorBidi"/>
+          <w:b/>
+          <w:bCs/>
+          <w:sz w:val="24"/>
+          <w:szCs w:val="24"/>
+        </w:rPr>
+        <w:t xml:space="preserve">START </w:t>
+      </w:r>
+      <w:r>
+        <w:rPr>
+          <w:rFonts w:asciiTheme="majorBidi" w:hAnsiTheme="majorBidi" w:cstheme="majorBidi"/>
+          <w:sz w:val="24"/>
+          <w:szCs w:val="24"/>
+        </w:rPr>
+        <w:t xml:space="preserve">Each bit in </w:t>
+      </w:r>
+      <w:r>
+        <w:rPr>
+          <w:rFonts w:asciiTheme="majorBidi" w:hAnsiTheme="majorBidi" w:cstheme="majorBidi"/>
+          <w:b/>
+          <w:bCs/>
+          <w:sz w:val="24"/>
+          <w:szCs w:val="24"/>
+        </w:rPr>
+        <w:t xml:space="preserve">START </w:t>
+      </w:r>
+      <w:r>
+        <w:rPr>
+          <w:rFonts w:asciiTheme="majorBidi" w:hAnsiTheme="majorBidi" w:cstheme="majorBidi"/>
+          <w:sz w:val="24"/>
+          <w:szCs w:val="24"/>
+        </w:rPr>
+        <w:t>indicates that a packet is starting in this flit.</w:t>
+      </w:r>
+    </w:p>
+    <w:p>
+      <w:pPr>
+        <w:spacing w:before="100" w:beforeAutospacing="1" w:after="100" w:afterAutospacing="1"/>
+        <w:ind w:left="360"/>
+        <w:rPr>
+          <w:rFonts w:asciiTheme="majorBidi" w:hAnsiTheme="majorBidi" w:cstheme="majorBidi"/>
+          <w:sz w:val="24"/>
+          <w:szCs w:val="24"/>
+        </w:rPr>
+      </w:pPr>
+      <w:r>
+        <w:rPr>
+          <w:rFonts w:asciiTheme="majorBidi" w:hAnsiTheme="majorBidi" w:cstheme="majorBidi"/>
+          <w:sz w:val="24"/>
+          <w:szCs w:val="24"/>
+        </w:rPr>
+        <w:t xml:space="preserve">The number of bits in </w:t>
+      </w:r>
+      <w:r>
+        <w:rPr>
+          <w:rFonts w:asciiTheme="majorBidi" w:hAnsiTheme="majorBidi" w:cstheme="majorBidi"/>
+          <w:b/>
+          <w:bCs/>
+          <w:sz w:val="24"/>
+          <w:szCs w:val="24"/>
+        </w:rPr>
+        <w:t xml:space="preserve">START </w:t>
+      </w:r>
+      <w:r>
+        <w:rPr>
+          <w:rFonts w:asciiTheme="majorBidi" w:hAnsiTheme="majorBidi" w:cstheme="majorBidi"/>
+          <w:sz w:val="24"/>
+          <w:szCs w:val="24"/>
+        </w:rPr>
+        <w:t>is CXSMAXPKTPERFLIT, which is the number of packets that can be</w:t>
+      </w:r>
+    </w:p>
+    <w:p>
+      <w:pPr>
+        <w:spacing w:before="100" w:beforeAutospacing="1" w:after="100" w:afterAutospacing="1"/>
+        <w:ind w:left="360"/>
+        <w:rPr>
+          <w:rFonts w:asciiTheme="majorBidi" w:hAnsiTheme="majorBidi" w:cstheme="majorBidi"/>
+          <w:sz w:val="24"/>
+          <w:szCs w:val="24"/>
+        </w:rPr>
+      </w:pPr>
+      <w:r>
+        <w:rPr>
+          <w:rFonts w:asciiTheme="majorBidi" w:hAnsiTheme="majorBidi" w:cstheme="majorBidi"/>
+          <w:sz w:val="24"/>
+          <w:szCs w:val="24"/>
+        </w:rPr>
+        <w:t>present in a flit of data. For example, when CXSMAXPKTPERFLIT = 4, then:</w:t>
+      </w:r>
+    </w:p>
+    <w:p>
+      <w:pPr>
+        <w:spacing w:before="100" w:beforeAutospacing="1" w:after="100" w:afterAutospacing="1"/>
+        <w:ind w:left="360"/>
+        <w:rPr>
+          <w:rFonts w:asciiTheme="majorBidi" w:hAnsiTheme="majorBidi" w:cstheme="majorBidi"/>
+          <w:sz w:val="24"/>
+          <w:szCs w:val="24"/>
+        </w:rPr>
+      </w:pPr>
+      <w:r>
+        <w:rPr>
+          <w:rFonts w:asciiTheme="majorBidi" w:hAnsiTheme="majorBidi" w:cstheme="majorBidi"/>
+          <w:sz w:val="24"/>
+          <w:szCs w:val="24"/>
+        </w:rPr>
+        <w:t xml:space="preserve">• </w:t>
+      </w:r>
+      <w:r>
+        <w:rPr>
+          <w:rFonts w:asciiTheme="majorBidi" w:hAnsiTheme="majorBidi" w:cstheme="majorBidi"/>
+          <w:b/>
+          <w:bCs/>
+          <w:sz w:val="24"/>
+          <w:szCs w:val="24"/>
+        </w:rPr>
+        <w:t>START</w:t>
+      </w:r>
+      <w:r>
+        <w:rPr>
+          <w:rFonts w:asciiTheme="majorBidi" w:hAnsiTheme="majorBidi" w:cstheme="majorBidi"/>
+          <w:sz w:val="24"/>
+          <w:szCs w:val="24"/>
+        </w:rPr>
+        <w:t>[0] = 1, at least one packet is starting in this flit.</w:t>
+      </w:r>
+    </w:p>
+    <w:p>
+      <w:pPr>
+        <w:spacing w:before="100" w:beforeAutospacing="1" w:after="100" w:afterAutospacing="1"/>
+        <w:ind w:left="360"/>
+        <w:rPr>
+          <w:rFonts w:asciiTheme="majorBidi" w:hAnsiTheme="majorBidi" w:cstheme="majorBidi"/>
+          <w:sz w:val="24"/>
+          <w:szCs w:val="24"/>
+        </w:rPr>
+      </w:pPr>
+      <w:r>
+        <w:rPr>
+          <w:rFonts w:asciiTheme="majorBidi" w:hAnsiTheme="majorBidi" w:cstheme="majorBidi"/>
+          <w:sz w:val="24"/>
+          <w:szCs w:val="24"/>
+        </w:rPr>
+        <w:t xml:space="preserve">• </w:t>
+      </w:r>
+      <w:r>
+        <w:rPr>
+          <w:rFonts w:asciiTheme="majorBidi" w:hAnsiTheme="majorBidi" w:cstheme="majorBidi"/>
+          <w:b/>
+          <w:bCs/>
+          <w:sz w:val="24"/>
+          <w:szCs w:val="24"/>
+        </w:rPr>
+        <w:t>START</w:t>
+      </w:r>
+      <w:r>
+        <w:rPr>
+          <w:rFonts w:asciiTheme="majorBidi" w:hAnsiTheme="majorBidi" w:cstheme="majorBidi"/>
+          <w:sz w:val="24"/>
+          <w:szCs w:val="24"/>
+        </w:rPr>
+        <w:t>[1] = 1, at least two packets are starting in this flit.</w:t>
+      </w:r>
+    </w:p>
+    <w:p>
+      <w:pPr>
+        <w:spacing w:before="100" w:beforeAutospacing="1" w:after="100" w:afterAutospacing="1"/>
+        <w:ind w:left="360"/>
+        <w:rPr>
+          <w:rFonts w:asciiTheme="majorBidi" w:hAnsiTheme="majorBidi" w:cstheme="majorBidi"/>
+          <w:sz w:val="24"/>
+          <w:szCs w:val="24"/>
+        </w:rPr>
+      </w:pPr>
+      <w:r>
+        <w:rPr>
+          <w:rFonts w:asciiTheme="majorBidi" w:hAnsiTheme="majorBidi" w:cstheme="majorBidi"/>
+          <w:sz w:val="24"/>
+          <w:szCs w:val="24"/>
+        </w:rPr>
+        <w:t xml:space="preserve">• </w:t>
+      </w:r>
+      <w:r>
+        <w:rPr>
+          <w:rFonts w:asciiTheme="majorBidi" w:hAnsiTheme="majorBidi" w:cstheme="majorBidi"/>
+          <w:b/>
+          <w:bCs/>
+          <w:sz w:val="24"/>
+          <w:szCs w:val="24"/>
+        </w:rPr>
+        <w:t>START</w:t>
+      </w:r>
+      <w:r>
+        <w:rPr>
+          <w:rFonts w:asciiTheme="majorBidi" w:hAnsiTheme="majorBidi" w:cstheme="majorBidi"/>
+          <w:sz w:val="24"/>
+          <w:szCs w:val="24"/>
+        </w:rPr>
+        <w:t>[2] = 1, at least three packets are starting in this flit.</w:t>
+      </w:r>
+    </w:p>
+    <w:p>
+      <w:pPr>
+        <w:spacing w:before="100" w:beforeAutospacing="1" w:after="100" w:afterAutospacing="1"/>
+        <w:ind w:left="360"/>
+        <w:rPr>
+          <w:rFonts w:asciiTheme="majorBidi" w:hAnsiTheme="majorBidi" w:cstheme="majorBidi"/>
+          <w:sz w:val="24"/>
+          <w:szCs w:val="24"/>
+        </w:rPr>
+      </w:pPr>
+      <w:r>
+        <w:rPr>
+          <w:rFonts w:asciiTheme="majorBidi" w:hAnsiTheme="majorBidi" w:cstheme="majorBidi"/>
+          <w:sz w:val="24"/>
+          <w:szCs w:val="24"/>
+        </w:rPr>
+        <w:t xml:space="preserve">• </w:t>
+      </w:r>
+      <w:r>
+        <w:rPr>
+          <w:rFonts w:asciiTheme="majorBidi" w:hAnsiTheme="majorBidi" w:cstheme="majorBidi"/>
+          <w:b/>
+          <w:bCs/>
+          <w:sz w:val="24"/>
+          <w:szCs w:val="24"/>
+        </w:rPr>
+        <w:t>START</w:t>
+      </w:r>
+      <w:r>
+        <w:rPr>
+          <w:rFonts w:asciiTheme="majorBidi" w:hAnsiTheme="majorBidi" w:cstheme="majorBidi"/>
+          <w:sz w:val="24"/>
+          <w:szCs w:val="24"/>
+        </w:rPr>
+        <w:t>[3] = 1, at least four packets are starting in this flit.</w:t>
+      </w:r>
+    </w:p>
+    <w:p>
+      <w:pPr>
+        <w:spacing w:before="100" w:beforeAutospacing="1" w:after="100" w:afterAutospacing="1"/>
+        <w:ind w:left="360"/>
+        <w:rPr>
+          <w:rFonts w:asciiTheme="majorBidi" w:hAnsiTheme="majorBidi" w:cstheme="majorBidi"/>
+          <w:sz w:val="24"/>
+          <w:szCs w:val="24"/>
+        </w:rPr>
+      </w:pPr>
+      <w:r>
+        <w:rPr>
+          <w:rFonts w:asciiTheme="majorBidi" w:hAnsiTheme="majorBidi" w:cstheme="majorBidi"/>
+          <w:sz w:val="24"/>
+          <w:szCs w:val="24"/>
+        </w:rPr>
+        <w:t xml:space="preserve">If any bit of </w:t>
+      </w:r>
+      <w:r>
+        <w:rPr>
+          <w:rFonts w:asciiTheme="majorBidi" w:hAnsiTheme="majorBidi" w:cstheme="majorBidi"/>
+          <w:b/>
+          <w:bCs/>
+          <w:sz w:val="24"/>
+          <w:szCs w:val="24"/>
+        </w:rPr>
+        <w:t xml:space="preserve">START </w:t>
+      </w:r>
+      <w:r>
+        <w:rPr>
+          <w:rFonts w:asciiTheme="majorBidi" w:hAnsiTheme="majorBidi" w:cstheme="majorBidi"/>
+          <w:sz w:val="24"/>
+          <w:szCs w:val="24"/>
+        </w:rPr>
+        <w:t xml:space="preserve">is 1, all lower bits of </w:t>
+      </w:r>
+      <w:r>
+        <w:rPr>
+          <w:rFonts w:asciiTheme="majorBidi" w:hAnsiTheme="majorBidi" w:cstheme="majorBidi"/>
+          <w:b/>
+          <w:bCs/>
+          <w:sz w:val="24"/>
+          <w:szCs w:val="24"/>
+        </w:rPr>
+        <w:t xml:space="preserve">START </w:t>
+      </w:r>
+      <w:r>
+        <w:rPr>
+          <w:rFonts w:asciiTheme="majorBidi" w:hAnsiTheme="majorBidi" w:cstheme="majorBidi"/>
+          <w:sz w:val="24"/>
+          <w:szCs w:val="24"/>
+        </w:rPr>
+        <w:t>must be 1.</w:t>
+      </w:r>
+    </w:p>
+    <w:p>
+      <w:pPr>
+        <w:spacing w:before="100" w:beforeAutospacing="1" w:after="100" w:afterAutospacing="1"/>
+        <w:ind w:left="360"/>
+        <w:rPr>
+          <w:rFonts w:asciiTheme="majorBidi" w:hAnsiTheme="majorBidi" w:cstheme="majorBidi"/>
+          <w:sz w:val="24"/>
+          <w:szCs w:val="24"/>
+        </w:rPr>
+      </w:pPr>
+      <w:r>
+        <w:rPr>
+          <w:rFonts w:asciiTheme="majorBidi" w:hAnsiTheme="majorBidi" w:cstheme="majorBidi"/>
+          <w:b/>
+          <w:bCs/>
+          <w:sz w:val="24"/>
+          <w:szCs w:val="24"/>
+        </w:rPr>
+        <w:t xml:space="preserve">START[N:0]PTR </w:t>
+      </w:r>
+      <w:r>
+        <w:rPr>
+          <w:rFonts w:asciiTheme="majorBidi" w:hAnsiTheme="majorBidi" w:cstheme="majorBidi"/>
+          <w:sz w:val="24"/>
+          <w:szCs w:val="24"/>
+        </w:rPr>
+        <w:t>This field is an array of pointers to the starting location of each of the packets in this flit.</w:t>
+      </w:r>
+    </w:p>
+    <w:p>
+      <w:pPr>
+        <w:spacing w:before="100" w:beforeAutospacing="1" w:after="100" w:afterAutospacing="1"/>
+        <w:ind w:left="360"/>
+        <w:rPr>
+          <w:rFonts w:asciiTheme="majorBidi" w:hAnsiTheme="majorBidi" w:cstheme="majorBidi"/>
+          <w:sz w:val="24"/>
+          <w:szCs w:val="24"/>
+        </w:rPr>
+      </w:pPr>
+      <w:r>
+        <w:rPr>
+          <w:rFonts w:asciiTheme="majorBidi" w:hAnsiTheme="majorBidi" w:cstheme="majorBidi"/>
+          <w:sz w:val="24"/>
+          <w:szCs w:val="24"/>
+        </w:rPr>
+        <w:t xml:space="preserve">• There is one pointer for each bit in the </w:t>
+      </w:r>
+      <w:r>
+        <w:rPr>
+          <w:rFonts w:asciiTheme="majorBidi" w:hAnsiTheme="majorBidi" w:cstheme="majorBidi"/>
+          <w:b/>
+          <w:bCs/>
+          <w:sz w:val="24"/>
+          <w:szCs w:val="24"/>
+        </w:rPr>
+        <w:t xml:space="preserve">START </w:t>
+      </w:r>
+      <w:r>
+        <w:rPr>
+          <w:rFonts w:asciiTheme="majorBidi" w:hAnsiTheme="majorBidi" w:cstheme="majorBidi"/>
+          <w:sz w:val="24"/>
+          <w:szCs w:val="24"/>
+        </w:rPr>
+        <w:t xml:space="preserve">field, valid if that bit of </w:t>
+      </w:r>
+      <w:r>
+        <w:rPr>
+          <w:rFonts w:asciiTheme="majorBidi" w:hAnsiTheme="majorBidi" w:cstheme="majorBidi"/>
+          <w:b/>
+          <w:bCs/>
+          <w:sz w:val="24"/>
+          <w:szCs w:val="24"/>
+        </w:rPr>
+        <w:t xml:space="preserve">START </w:t>
+      </w:r>
+      <w:r>
+        <w:rPr>
+          <w:rFonts w:asciiTheme="majorBidi" w:hAnsiTheme="majorBidi" w:cstheme="majorBidi"/>
+          <w:sz w:val="24"/>
+          <w:szCs w:val="24"/>
+        </w:rPr>
+        <w:t>is set.</w:t>
+      </w:r>
+    </w:p>
+    <w:p>
+      <w:pPr>
+        <w:spacing w:before="100" w:beforeAutospacing="1" w:after="100" w:afterAutospacing="1"/>
+        <w:ind w:left="360"/>
+        <w:rPr>
+          <w:rFonts w:asciiTheme="majorBidi" w:hAnsiTheme="majorBidi" w:cstheme="majorBidi"/>
+          <w:sz w:val="24"/>
+          <w:szCs w:val="24"/>
+        </w:rPr>
+      </w:pPr>
+      <w:r>
+        <w:rPr>
+          <w:rFonts w:asciiTheme="majorBidi" w:hAnsiTheme="majorBidi" w:cstheme="majorBidi"/>
+          <w:sz w:val="24"/>
+          <w:szCs w:val="24"/>
+        </w:rPr>
+        <w:t xml:space="preserve">• If the corresponding </w:t>
+      </w:r>
+      <w:r>
+        <w:rPr>
+          <w:rFonts w:asciiTheme="majorBidi" w:hAnsiTheme="majorBidi" w:cstheme="majorBidi"/>
+          <w:b/>
+          <w:bCs/>
+          <w:sz w:val="24"/>
+          <w:szCs w:val="24"/>
+        </w:rPr>
+        <w:t xml:space="preserve">START </w:t>
+      </w:r>
+      <w:r>
+        <w:rPr>
+          <w:rFonts w:asciiTheme="majorBidi" w:hAnsiTheme="majorBidi" w:cstheme="majorBidi"/>
+          <w:sz w:val="24"/>
+          <w:szCs w:val="24"/>
+        </w:rPr>
+        <w:t>bit is 0, the pointer can have any value and should be ignored.</w:t>
+      </w:r>
+    </w:p>
+    <w:p>
+      <w:pPr>
+        <w:spacing w:before="100" w:beforeAutospacing="1" w:after="100" w:afterAutospacing="1"/>
+        <w:ind w:left="360"/>
+        <w:rPr>
+          <w:rFonts w:asciiTheme="majorBidi" w:hAnsiTheme="majorBidi" w:cstheme="majorBidi"/>
+          <w:sz w:val="24"/>
+          <w:szCs w:val="24"/>
+        </w:rPr>
+      </w:pPr>
+      <w:r>
+        <w:rPr>
+          <w:rFonts w:asciiTheme="majorBidi" w:hAnsiTheme="majorBidi" w:cstheme="majorBidi"/>
+          <w:sz w:val="24"/>
+          <w:szCs w:val="24"/>
+        </w:rPr>
+        <w:t>• All packet starts are 16-byte aligned.</w:t>
+      </w:r>
+    </w:p>
+    <w:p>
+      <w:pPr>
+        <w:spacing w:before="100" w:beforeAutospacing="1" w:after="100" w:afterAutospacing="1"/>
+        <w:ind w:left="360"/>
+        <w:rPr>
+          <w:rFonts w:asciiTheme="majorBidi" w:hAnsiTheme="majorBidi" w:cstheme="majorBidi"/>
+          <w:sz w:val="24"/>
+          <w:szCs w:val="24"/>
+        </w:rPr>
+      </w:pPr>
+      <w:r>
+        <w:rPr>
+          <w:rFonts w:asciiTheme="majorBidi" w:hAnsiTheme="majorBidi" w:cstheme="majorBidi"/>
+          <w:sz w:val="24"/>
+          <w:szCs w:val="24"/>
+        </w:rPr>
+        <w:t>• The width of each pointer is log2(CXSDATAFLITWIDTH/128) bits.</w:t>
+      </w:r>
+    </w:p>
+    <w:p>
+      <w:pPr>
+        <w:spacing w:before="100" w:beforeAutospacing="1" w:after="100" w:afterAutospacing="1"/>
+        <w:ind w:left="360"/>
+        <w:rPr>
+          <w:rFonts w:asciiTheme="majorBidi" w:hAnsiTheme="majorBidi" w:cstheme="majorBidi"/>
+          <w:sz w:val="24"/>
+          <w:szCs w:val="24"/>
+        </w:rPr>
+      </w:pPr>
+      <w:r>
+        <w:rPr>
+          <w:rFonts w:asciiTheme="majorBidi" w:hAnsiTheme="majorBidi" w:cstheme="majorBidi"/>
+          <w:sz w:val="24"/>
+          <w:szCs w:val="24"/>
+        </w:rPr>
+        <w:t>• The first byte of the Xth starting packet is (</w:t>
+      </w:r>
+      <w:r>
+        <w:rPr>
+          <w:rFonts w:asciiTheme="majorBidi" w:hAnsiTheme="majorBidi" w:cstheme="majorBidi"/>
+          <w:b/>
+          <w:bCs/>
+          <w:sz w:val="24"/>
+          <w:szCs w:val="24"/>
+        </w:rPr>
+        <w:t>START</w:t>
+      </w:r>
+      <w:r>
+        <w:rPr>
+          <w:rFonts w:asciiTheme="majorBidi" w:hAnsiTheme="majorBidi" w:cstheme="majorBidi"/>
+          <w:sz w:val="24"/>
+          <w:szCs w:val="24"/>
+        </w:rPr>
+        <w:t>[X]</w:t>
+      </w:r>
+      <w:r>
+        <w:rPr>
+          <w:rFonts w:asciiTheme="majorBidi" w:hAnsiTheme="majorBidi" w:cstheme="majorBidi"/>
+          <w:b/>
+          <w:bCs/>
+          <w:sz w:val="24"/>
+          <w:szCs w:val="24"/>
+        </w:rPr>
+        <w:t xml:space="preserve">PTR </w:t>
+      </w:r>
+      <w:r>
+        <w:rPr>
+          <w:rFonts w:asciiTheme="majorBidi" w:hAnsiTheme="majorBidi" w:cstheme="majorBidi"/>
+          <w:sz w:val="24"/>
+          <w:szCs w:val="24"/>
+        </w:rPr>
+        <w:t>&lt;&lt; 4).</w:t>
+      </w:r>
+    </w:p>
+    <w:p>
+      <w:pPr>
+        <w:spacing w:before="100" w:beforeAutospacing="1" w:after="100" w:afterAutospacing="1"/>
+        <w:ind w:left="360"/>
+        <w:rPr>
+          <w:rFonts w:asciiTheme="majorBidi" w:hAnsiTheme="majorBidi" w:cstheme="majorBidi"/>
+          <w:sz w:val="24"/>
+          <w:szCs w:val="24"/>
+        </w:rPr>
+      </w:pPr>
+      <w:r>
+        <w:rPr>
+          <w:rFonts w:asciiTheme="majorBidi" w:hAnsiTheme="majorBidi" w:cstheme="majorBidi"/>
+          <w:sz w:val="24"/>
+          <w:szCs w:val="24"/>
+        </w:rPr>
+        <w:t xml:space="preserve">• Start pointers are defined to be monotonically increasing, for example </w:t>
+      </w:r>
+      <w:r>
+        <w:rPr>
+          <w:rFonts w:asciiTheme="majorBidi" w:hAnsiTheme="majorBidi" w:cstheme="majorBidi"/>
+          <w:b/>
+          <w:bCs/>
+          <w:sz w:val="24"/>
+          <w:szCs w:val="24"/>
+        </w:rPr>
+        <w:t xml:space="preserve">START1PTR </w:t>
+      </w:r>
+      <w:r>
+        <w:rPr>
+          <w:rFonts w:asciiTheme="majorBidi" w:hAnsiTheme="majorBidi" w:cstheme="majorBidi"/>
+          <w:sz w:val="24"/>
+          <w:szCs w:val="24"/>
+        </w:rPr>
+        <w:t>must be</w:t>
+      </w:r>
+    </w:p>
+    <w:p>
+      <w:pPr>
+        <w:spacing w:before="100" w:beforeAutospacing="1" w:after="100" w:afterAutospacing="1"/>
+        <w:ind w:left="360"/>
+        <w:rPr>
+          <w:rFonts w:asciiTheme="majorBidi" w:hAnsiTheme="majorBidi" w:cstheme="majorBidi"/>
+          <w:sz w:val="24"/>
+          <w:szCs w:val="24"/>
+        </w:rPr>
+      </w:pPr>
+      <w:r>
+        <w:rPr>
+          <w:rFonts w:asciiTheme="majorBidi" w:hAnsiTheme="majorBidi" w:cstheme="majorBidi"/>
+          <w:sz w:val="24"/>
+          <w:szCs w:val="24"/>
+        </w:rPr>
+        <w:t xml:space="preserve">greater than </w:t>
+      </w:r>
+      <w:r>
+        <w:rPr>
+          <w:rFonts w:asciiTheme="majorBidi" w:hAnsiTheme="majorBidi" w:cstheme="majorBidi"/>
+          <w:b/>
+          <w:bCs/>
+          <w:sz w:val="24"/>
+          <w:szCs w:val="24"/>
+        </w:rPr>
+        <w:t>START0PTR</w:t>
+      </w:r>
+      <w:r>
+        <w:rPr>
+          <w:rFonts w:asciiTheme="majorBidi" w:hAnsiTheme="majorBidi" w:cstheme="majorBidi"/>
+          <w:sz w:val="24"/>
+          <w:szCs w:val="24"/>
+        </w:rPr>
+        <w:t>.</w:t>
+      </w:r>
+    </w:p>
+    <w:p>
+      <w:pPr>
+        <w:spacing w:before="100" w:beforeAutospacing="1" w:after="100" w:afterAutospacing="1"/>
+        <w:ind w:left="360"/>
+        <w:rPr>
+          <w:rFonts w:asciiTheme="majorBidi" w:hAnsiTheme="majorBidi" w:cstheme="majorBidi"/>
+          <w:sz w:val="24"/>
+          <w:szCs w:val="24"/>
+        </w:rPr>
+      </w:pPr>
+    </w:p>
+    <w:p>
+      <w:pPr>
+        <w:spacing w:before="100" w:beforeAutospacing="1" w:after="100" w:afterAutospacing="1"/>
+        <w:ind w:left="360"/>
+        <w:rPr>
+          <w:rFonts w:asciiTheme="majorBidi" w:hAnsiTheme="majorBidi" w:cstheme="majorBidi"/>
+          <w:b/>
+          <w:bCs/>
+          <w:sz w:val="24"/>
+          <w:szCs w:val="24"/>
+        </w:rPr>
+      </w:pPr>
+      <w:r>
+        <w:rPr>
+          <w:rFonts w:asciiTheme="majorBidi" w:hAnsiTheme="majorBidi" w:cstheme="majorBidi"/>
+          <w:b/>
+          <w:bCs/>
+          <w:sz w:val="24"/>
+          <w:szCs w:val="24"/>
+        </w:rPr>
+        <w:t>4.2.2 Packet control field structure</w:t>
+      </w:r>
+    </w:p>
+    <w:p>
+      <w:pPr>
+        <w:spacing w:before="100" w:beforeAutospacing="1" w:after="100" w:afterAutospacing="1"/>
+        <w:ind w:left="360"/>
+        <w:rPr>
+          <w:rFonts w:asciiTheme="majorBidi" w:hAnsiTheme="majorBidi" w:cstheme="majorBidi"/>
+          <w:sz w:val="24"/>
+          <w:szCs w:val="24"/>
+        </w:rPr>
+      </w:pPr>
+      <w:r>
+        <w:rPr>
+          <w:rFonts w:asciiTheme="majorBidi" w:hAnsiTheme="majorBidi" w:cstheme="majorBidi"/>
+          <w:sz w:val="24"/>
+          <w:szCs w:val="24"/>
+        </w:rPr>
+        <w:t>Table 4-2 shows Packet control field widths and placement information for all combinations of</w:t>
+      </w:r>
+    </w:p>
+    <w:p>
+      <w:pPr>
+        <w:spacing w:before="100" w:beforeAutospacing="1" w:after="100" w:afterAutospacing="1"/>
+        <w:ind w:left="360"/>
+        <w:rPr>
+          <w:rFonts w:asciiTheme="majorBidi" w:hAnsiTheme="majorBidi" w:cstheme="majorBidi"/>
+          <w:sz w:val="24"/>
+          <w:szCs w:val="24"/>
+        </w:rPr>
+      </w:pPr>
+      <w:r>
+        <w:rPr>
+          <w:rFonts w:asciiTheme="majorBidi" w:hAnsiTheme="majorBidi" w:cstheme="majorBidi"/>
+          <w:sz w:val="24"/>
+          <w:szCs w:val="24"/>
+        </w:rPr>
+        <w:t xml:space="preserve">CXSMAXPKTPERFLIT and CXSDATAFLITWIDTH. </w:t>
+      </w:r>
+    </w:p>
+    <w:p>
+      <w:pPr>
+        <w:spacing w:before="100" w:beforeAutospacing="1" w:after="100" w:afterAutospacing="1"/>
+        <w:ind w:left="360"/>
+        <w:rPr>
+          <w:rFonts w:asciiTheme="majorBidi" w:hAnsiTheme="majorBidi" w:cstheme="majorBidi"/>
+          <w:sz w:val="24"/>
+          <w:szCs w:val="24"/>
+        </w:rPr>
+      </w:pPr>
+      <w:r>
+        <w:rPr>
+          <w:rFonts w:asciiTheme="majorBidi" w:hAnsiTheme="majorBidi" w:cstheme="majorBidi"/>
+          <w:sz w:val="24"/>
+          <w:szCs w:val="24"/>
+        </w:rPr>
+        <w:t>these structures are used.</w:t>
+      </w:r>
+    </w:p>
+    <w:p>
+      <w:pPr>
+        <w:spacing w:before="100" w:beforeAutospacing="1" w:after="100" w:afterAutospacing="1"/>
+        <w:ind w:left="360"/>
+        <w:rPr>
+          <w:rFonts w:asciiTheme="majorBidi" w:hAnsiTheme="majorBidi" w:cstheme="majorBidi"/>
+          <w:sz w:val="24"/>
+          <w:szCs w:val="24"/>
+        </w:rPr>
+      </w:pPr>
+      <w:r>
+        <w:rPr>
+          <w:rFonts w:asciiTheme="majorBidi" w:hAnsiTheme="majorBidi" w:cstheme="majorBidi"/>
+          <w:b/>
+          <w:bCs/>
+          <w:sz w:val="24"/>
+          <w:szCs w:val="24"/>
+        </w:rPr>
+        <w:t xml:space="preserve">END </w:t>
+      </w:r>
+      <w:r>
+        <w:rPr>
+          <w:rFonts w:asciiTheme="majorBidi" w:hAnsiTheme="majorBidi" w:cstheme="majorBidi"/>
+          <w:sz w:val="24"/>
+          <w:szCs w:val="24"/>
+        </w:rPr>
+        <w:t xml:space="preserve">Each bit in </w:t>
+      </w:r>
+      <w:r>
+        <w:rPr>
+          <w:rFonts w:asciiTheme="majorBidi" w:hAnsiTheme="majorBidi" w:cstheme="majorBidi"/>
+          <w:b/>
+          <w:bCs/>
+          <w:sz w:val="24"/>
+          <w:szCs w:val="24"/>
+        </w:rPr>
+        <w:t xml:space="preserve">END </w:t>
+      </w:r>
+      <w:r>
+        <w:rPr>
+          <w:rFonts w:asciiTheme="majorBidi" w:hAnsiTheme="majorBidi" w:cstheme="majorBidi"/>
+          <w:sz w:val="24"/>
+          <w:szCs w:val="24"/>
+        </w:rPr>
+        <w:t>indicates that a packet is ending in this flit.</w:t>
+      </w:r>
+    </w:p>
+    <w:p>
+      <w:pPr>
+        <w:spacing w:before="100" w:beforeAutospacing="1" w:after="100" w:afterAutospacing="1"/>
+        <w:ind w:left="360"/>
+        <w:rPr>
+          <w:rFonts w:asciiTheme="majorBidi" w:hAnsiTheme="majorBidi" w:cstheme="majorBidi"/>
+          <w:sz w:val="24"/>
+          <w:szCs w:val="24"/>
+        </w:rPr>
+      </w:pPr>
+      <w:r>
+        <w:rPr>
+          <w:rFonts w:asciiTheme="majorBidi" w:hAnsiTheme="majorBidi" w:cstheme="majorBidi"/>
+          <w:sz w:val="24"/>
+          <w:szCs w:val="24"/>
+        </w:rPr>
+        <w:lastRenderedPageBreak/>
+        <w:t xml:space="preserve">The number of bits in </w:t>
+      </w:r>
+      <w:r>
+        <w:rPr>
+          <w:rFonts w:asciiTheme="majorBidi" w:hAnsiTheme="majorBidi" w:cstheme="majorBidi"/>
+          <w:b/>
+          <w:bCs/>
+          <w:sz w:val="24"/>
+          <w:szCs w:val="24"/>
+        </w:rPr>
+        <w:t xml:space="preserve">END </w:t>
+      </w:r>
+      <w:r>
+        <w:rPr>
+          <w:rFonts w:asciiTheme="majorBidi" w:hAnsiTheme="majorBidi" w:cstheme="majorBidi"/>
+          <w:sz w:val="24"/>
+          <w:szCs w:val="24"/>
+        </w:rPr>
+        <w:t>is CXSMAXPKTPERFLIT, which is the number of packets that can be</w:t>
+      </w:r>
+    </w:p>
+    <w:p>
+      <w:pPr>
+        <w:spacing w:before="100" w:beforeAutospacing="1" w:after="100" w:afterAutospacing="1"/>
+        <w:ind w:left="360"/>
+        <w:rPr>
+          <w:rFonts w:asciiTheme="majorBidi" w:hAnsiTheme="majorBidi" w:cstheme="majorBidi"/>
+          <w:sz w:val="24"/>
+          <w:szCs w:val="24"/>
+        </w:rPr>
+      </w:pPr>
+      <w:r>
+        <w:rPr>
+          <w:rFonts w:asciiTheme="majorBidi" w:hAnsiTheme="majorBidi" w:cstheme="majorBidi"/>
+          <w:sz w:val="24"/>
+          <w:szCs w:val="24"/>
+        </w:rPr>
+        <w:t>present in a flit of data. For example, when CXSMAXPKTPERFLIT = 4, then:</w:t>
+      </w:r>
+    </w:p>
+    <w:p>
+      <w:pPr>
+        <w:spacing w:before="100" w:beforeAutospacing="1" w:after="100" w:afterAutospacing="1"/>
+        <w:ind w:left="360"/>
+        <w:rPr>
+          <w:rFonts w:asciiTheme="majorBidi" w:hAnsiTheme="majorBidi" w:cstheme="majorBidi"/>
+          <w:sz w:val="24"/>
+          <w:szCs w:val="24"/>
+        </w:rPr>
+      </w:pPr>
+      <w:r>
+        <w:rPr>
+          <w:rFonts w:asciiTheme="majorBidi" w:hAnsiTheme="majorBidi" w:cstheme="majorBidi"/>
+          <w:sz w:val="24"/>
+          <w:szCs w:val="24"/>
+        </w:rPr>
+        <w:t xml:space="preserve">• </w:t>
+      </w:r>
+      <w:r>
+        <w:rPr>
+          <w:rFonts w:asciiTheme="majorBidi" w:hAnsiTheme="majorBidi" w:cstheme="majorBidi"/>
+          <w:b/>
+          <w:bCs/>
+          <w:sz w:val="24"/>
+          <w:szCs w:val="24"/>
+        </w:rPr>
+        <w:t>END</w:t>
+      </w:r>
+      <w:r>
+        <w:rPr>
+          <w:rFonts w:asciiTheme="majorBidi" w:hAnsiTheme="majorBidi" w:cstheme="majorBidi"/>
+          <w:sz w:val="24"/>
+          <w:szCs w:val="24"/>
+        </w:rPr>
+        <w:t>[0] = 1, at least one packet is ending in this flit.</w:t>
+      </w:r>
+    </w:p>
+    <w:p>
+      <w:pPr>
+        <w:spacing w:before="100" w:beforeAutospacing="1" w:after="100" w:afterAutospacing="1"/>
+        <w:ind w:left="360"/>
+        <w:rPr>
+          <w:rFonts w:asciiTheme="majorBidi" w:hAnsiTheme="majorBidi" w:cstheme="majorBidi"/>
+          <w:sz w:val="24"/>
+          <w:szCs w:val="24"/>
+        </w:rPr>
+      </w:pPr>
+      <w:r>
+        <w:rPr>
+          <w:rFonts w:asciiTheme="majorBidi" w:hAnsiTheme="majorBidi" w:cstheme="majorBidi"/>
+          <w:sz w:val="24"/>
+          <w:szCs w:val="24"/>
+        </w:rPr>
+        <w:t xml:space="preserve">• </w:t>
+      </w:r>
+      <w:r>
+        <w:rPr>
+          <w:rFonts w:asciiTheme="majorBidi" w:hAnsiTheme="majorBidi" w:cstheme="majorBidi"/>
+          <w:b/>
+          <w:bCs/>
+          <w:sz w:val="24"/>
+          <w:szCs w:val="24"/>
+        </w:rPr>
+        <w:t>END</w:t>
+      </w:r>
+      <w:r>
+        <w:rPr>
+          <w:rFonts w:asciiTheme="majorBidi" w:hAnsiTheme="majorBidi" w:cstheme="majorBidi"/>
+          <w:sz w:val="24"/>
+          <w:szCs w:val="24"/>
+        </w:rPr>
+        <w:t>[1] = 1, at least two packets are ending in this flit.</w:t>
+      </w:r>
+    </w:p>
+    <w:p>
+      <w:pPr>
+        <w:spacing w:before="100" w:beforeAutospacing="1" w:after="100" w:afterAutospacing="1"/>
+        <w:ind w:left="360"/>
+        <w:rPr>
+          <w:rFonts w:asciiTheme="majorBidi" w:hAnsiTheme="majorBidi" w:cstheme="majorBidi"/>
+          <w:sz w:val="24"/>
+          <w:szCs w:val="24"/>
+        </w:rPr>
+      </w:pPr>
+      <w:r>
+        <w:rPr>
+          <w:rFonts w:asciiTheme="majorBidi" w:hAnsiTheme="majorBidi" w:cstheme="majorBidi"/>
+          <w:sz w:val="24"/>
+          <w:szCs w:val="24"/>
+        </w:rPr>
+        <w:t xml:space="preserve">• </w:t>
+      </w:r>
+      <w:r>
+        <w:rPr>
+          <w:rFonts w:asciiTheme="majorBidi" w:hAnsiTheme="majorBidi" w:cstheme="majorBidi"/>
+          <w:b/>
+          <w:bCs/>
+          <w:sz w:val="24"/>
+          <w:szCs w:val="24"/>
+        </w:rPr>
+        <w:t>END</w:t>
+      </w:r>
+      <w:r>
+        <w:rPr>
+          <w:rFonts w:asciiTheme="majorBidi" w:hAnsiTheme="majorBidi" w:cstheme="majorBidi"/>
+          <w:sz w:val="24"/>
+          <w:szCs w:val="24"/>
+        </w:rPr>
+        <w:t>[2] = 1, at least three packets are ending in this flit.</w:t>
+      </w:r>
+    </w:p>
+    <w:p>
+      <w:pPr>
+        <w:spacing w:before="100" w:beforeAutospacing="1" w:after="100" w:afterAutospacing="1"/>
+        <w:ind w:left="360"/>
+        <w:rPr>
+          <w:rFonts w:asciiTheme="majorBidi" w:hAnsiTheme="majorBidi" w:cstheme="majorBidi"/>
+          <w:sz w:val="24"/>
+          <w:szCs w:val="24"/>
+        </w:rPr>
+      </w:pPr>
+      <w:r>
+        <w:rPr>
+          <w:rFonts w:asciiTheme="majorBidi" w:hAnsiTheme="majorBidi" w:cstheme="majorBidi"/>
+          <w:sz w:val="24"/>
+          <w:szCs w:val="24"/>
+        </w:rPr>
+        <w:t xml:space="preserve">• </w:t>
+      </w:r>
+      <w:r>
+        <w:rPr>
+          <w:rFonts w:asciiTheme="majorBidi" w:hAnsiTheme="majorBidi" w:cstheme="majorBidi"/>
+          <w:b/>
+          <w:bCs/>
+          <w:sz w:val="24"/>
+          <w:szCs w:val="24"/>
+        </w:rPr>
+        <w:t>END</w:t>
+      </w:r>
+      <w:r>
+        <w:rPr>
+          <w:rFonts w:asciiTheme="majorBidi" w:hAnsiTheme="majorBidi" w:cstheme="majorBidi"/>
+          <w:sz w:val="24"/>
+          <w:szCs w:val="24"/>
+        </w:rPr>
+        <w:t>[3] = 1, at least four packets are ending in this flit.</w:t>
+      </w:r>
+    </w:p>
+    <w:p>
+      <w:pPr>
+        <w:spacing w:before="100" w:beforeAutospacing="1" w:after="100" w:afterAutospacing="1"/>
+        <w:ind w:left="360"/>
+        <w:rPr>
+          <w:rFonts w:asciiTheme="majorBidi" w:hAnsiTheme="majorBidi" w:cstheme="majorBidi"/>
+          <w:sz w:val="24"/>
+          <w:szCs w:val="24"/>
+        </w:rPr>
+      </w:pPr>
+      <w:r>
+        <w:rPr>
+          <w:rFonts w:asciiTheme="majorBidi" w:hAnsiTheme="majorBidi" w:cstheme="majorBidi"/>
+          <w:sz w:val="24"/>
+          <w:szCs w:val="24"/>
+        </w:rPr>
+        <w:t xml:space="preserve">If any bit of </w:t>
+      </w:r>
+      <w:r>
+        <w:rPr>
+          <w:rFonts w:asciiTheme="majorBidi" w:hAnsiTheme="majorBidi" w:cstheme="majorBidi"/>
+          <w:b/>
+          <w:bCs/>
+          <w:sz w:val="24"/>
+          <w:szCs w:val="24"/>
+        </w:rPr>
+        <w:t xml:space="preserve">END </w:t>
+      </w:r>
+      <w:r>
+        <w:rPr>
+          <w:rFonts w:asciiTheme="majorBidi" w:hAnsiTheme="majorBidi" w:cstheme="majorBidi"/>
+          <w:sz w:val="24"/>
+          <w:szCs w:val="24"/>
+        </w:rPr>
+        <w:t xml:space="preserve">is 1, all lower bits of </w:t>
+      </w:r>
+      <w:r>
+        <w:rPr>
+          <w:rFonts w:asciiTheme="majorBidi" w:hAnsiTheme="majorBidi" w:cstheme="majorBidi"/>
+          <w:b/>
+          <w:bCs/>
+          <w:sz w:val="24"/>
+          <w:szCs w:val="24"/>
+        </w:rPr>
+        <w:t xml:space="preserve">END </w:t>
+      </w:r>
+      <w:r>
+        <w:rPr>
+          <w:rFonts w:asciiTheme="majorBidi" w:hAnsiTheme="majorBidi" w:cstheme="majorBidi"/>
+          <w:sz w:val="24"/>
+          <w:szCs w:val="24"/>
+        </w:rPr>
+        <w:t>must be 1.</w:t>
+      </w:r>
+    </w:p>
+    <w:p>
+      <w:pPr>
+        <w:spacing w:before="100" w:beforeAutospacing="1" w:after="100" w:afterAutospacing="1"/>
+        <w:ind w:left="360"/>
+        <w:rPr>
+          <w:rFonts w:asciiTheme="majorBidi" w:hAnsiTheme="majorBidi" w:cstheme="majorBidi"/>
+          <w:sz w:val="24"/>
+          <w:szCs w:val="24"/>
+        </w:rPr>
+      </w:pPr>
+      <w:r>
+        <w:rPr>
+          <w:rFonts w:asciiTheme="majorBidi" w:hAnsiTheme="majorBidi" w:cstheme="majorBidi"/>
+          <w:b/>
+          <w:bCs/>
+          <w:sz w:val="24"/>
+          <w:szCs w:val="24"/>
+        </w:rPr>
+        <w:t xml:space="preserve">ENDERROR </w:t>
+      </w:r>
+      <w:r>
+        <w:rPr>
+          <w:rFonts w:asciiTheme="majorBidi" w:hAnsiTheme="majorBidi" w:cstheme="majorBidi"/>
+          <w:sz w:val="24"/>
+          <w:szCs w:val="24"/>
+        </w:rPr>
+        <w:t xml:space="preserve">Each bit in </w:t>
+      </w:r>
+      <w:r>
+        <w:rPr>
+          <w:rFonts w:asciiTheme="majorBidi" w:hAnsiTheme="majorBidi" w:cstheme="majorBidi"/>
+          <w:b/>
+          <w:bCs/>
+          <w:sz w:val="24"/>
+          <w:szCs w:val="24"/>
+        </w:rPr>
+        <w:t xml:space="preserve">ENDERROR </w:t>
+      </w:r>
+      <w:r>
+        <w:rPr>
+          <w:rFonts w:asciiTheme="majorBidi" w:hAnsiTheme="majorBidi" w:cstheme="majorBidi"/>
+          <w:sz w:val="24"/>
+          <w:szCs w:val="24"/>
+        </w:rPr>
+        <w:t>indicates that a packet is ending with an error condition in this flit</w:t>
+      </w:r>
+    </w:p>
+    <w:p>
+      <w:pPr>
+        <w:spacing w:before="100" w:beforeAutospacing="1" w:after="100" w:afterAutospacing="1"/>
+        <w:ind w:left="360"/>
+        <w:rPr>
+          <w:rFonts w:asciiTheme="majorBidi" w:hAnsiTheme="majorBidi" w:cstheme="majorBidi"/>
+          <w:sz w:val="24"/>
+          <w:szCs w:val="24"/>
+        </w:rPr>
+      </w:pPr>
+      <w:r>
+        <w:rPr>
+          <w:rFonts w:asciiTheme="majorBidi" w:hAnsiTheme="majorBidi" w:cstheme="majorBidi"/>
+          <w:sz w:val="24"/>
+          <w:szCs w:val="24"/>
+        </w:rPr>
+        <w:t xml:space="preserve">• </w:t>
+      </w:r>
+      <w:r>
+        <w:rPr>
+          <w:rFonts w:asciiTheme="majorBidi" w:hAnsiTheme="majorBidi" w:cstheme="majorBidi"/>
+          <w:b/>
+          <w:bCs/>
+          <w:sz w:val="24"/>
+          <w:szCs w:val="24"/>
+        </w:rPr>
+        <w:t>ENDERROR</w:t>
+      </w:r>
+      <w:r>
+        <w:rPr>
+          <w:rFonts w:asciiTheme="majorBidi" w:hAnsiTheme="majorBidi" w:cstheme="majorBidi"/>
+          <w:sz w:val="24"/>
+          <w:szCs w:val="24"/>
+        </w:rPr>
+        <w:t>[0] = 1, the first packet ending this cycle has an error.</w:t>
+      </w:r>
+    </w:p>
+    <w:p>
+      <w:pPr>
+        <w:spacing w:before="100" w:beforeAutospacing="1" w:after="100" w:afterAutospacing="1"/>
+        <w:ind w:left="360"/>
+        <w:rPr>
+          <w:rFonts w:asciiTheme="majorBidi" w:hAnsiTheme="majorBidi" w:cstheme="majorBidi"/>
+          <w:sz w:val="24"/>
+          <w:szCs w:val="24"/>
+        </w:rPr>
+      </w:pPr>
+      <w:r>
+        <w:rPr>
+          <w:rFonts w:asciiTheme="majorBidi" w:hAnsiTheme="majorBidi" w:cstheme="majorBidi"/>
+          <w:sz w:val="24"/>
+          <w:szCs w:val="24"/>
+        </w:rPr>
+        <w:t xml:space="preserve">• </w:t>
+      </w:r>
+      <w:r>
+        <w:rPr>
+          <w:rFonts w:asciiTheme="majorBidi" w:hAnsiTheme="majorBidi" w:cstheme="majorBidi"/>
+          <w:b/>
+          <w:bCs/>
+          <w:sz w:val="24"/>
+          <w:szCs w:val="24"/>
+        </w:rPr>
+        <w:t>ENDERROR</w:t>
+      </w:r>
+      <w:r>
+        <w:rPr>
+          <w:rFonts w:asciiTheme="majorBidi" w:hAnsiTheme="majorBidi" w:cstheme="majorBidi"/>
+          <w:sz w:val="24"/>
+          <w:szCs w:val="24"/>
+        </w:rPr>
+        <w:t>[1] = 1, the second packet ending this cycle has an error.</w:t>
+      </w:r>
+    </w:p>
+    <w:p>
+      <w:pPr>
+        <w:spacing w:before="100" w:beforeAutospacing="1" w:after="100" w:afterAutospacing="1"/>
+        <w:ind w:left="360"/>
+        <w:rPr>
+          <w:rFonts w:asciiTheme="majorBidi" w:hAnsiTheme="majorBidi" w:cstheme="majorBidi"/>
+          <w:sz w:val="24"/>
+          <w:szCs w:val="24"/>
+        </w:rPr>
+      </w:pPr>
+      <w:r>
+        <w:rPr>
+          <w:rFonts w:asciiTheme="majorBidi" w:hAnsiTheme="majorBidi" w:cstheme="majorBidi"/>
+          <w:sz w:val="24"/>
+          <w:szCs w:val="24"/>
+        </w:rPr>
+        <w:t xml:space="preserve">• </w:t>
+      </w:r>
+      <w:r>
+        <w:rPr>
+          <w:rFonts w:asciiTheme="majorBidi" w:hAnsiTheme="majorBidi" w:cstheme="majorBidi"/>
+          <w:b/>
+          <w:bCs/>
+          <w:sz w:val="24"/>
+          <w:szCs w:val="24"/>
+        </w:rPr>
+        <w:t>ENDERROR</w:t>
+      </w:r>
+      <w:r>
+        <w:rPr>
+          <w:rFonts w:asciiTheme="majorBidi" w:hAnsiTheme="majorBidi" w:cstheme="majorBidi"/>
+          <w:sz w:val="24"/>
+          <w:szCs w:val="24"/>
+        </w:rPr>
+        <w:t>[2] = 1, the third packet ending this cycle has an error.</w:t>
+      </w:r>
+    </w:p>
+    <w:p>
+      <w:pPr>
+        <w:spacing w:before="100" w:beforeAutospacing="1" w:after="100" w:afterAutospacing="1"/>
+        <w:ind w:left="360"/>
+        <w:rPr>
+          <w:rFonts w:asciiTheme="majorBidi" w:hAnsiTheme="majorBidi" w:cstheme="majorBidi"/>
+          <w:sz w:val="24"/>
+          <w:szCs w:val="24"/>
+        </w:rPr>
+      </w:pPr>
+      <w:r>
+        <w:rPr>
+          <w:rFonts w:asciiTheme="majorBidi" w:hAnsiTheme="majorBidi" w:cstheme="majorBidi"/>
+          <w:sz w:val="24"/>
+          <w:szCs w:val="24"/>
+        </w:rPr>
+        <w:t xml:space="preserve">• </w:t>
+      </w:r>
+      <w:r>
+        <w:rPr>
+          <w:rFonts w:asciiTheme="majorBidi" w:hAnsiTheme="majorBidi" w:cstheme="majorBidi"/>
+          <w:b/>
+          <w:bCs/>
+          <w:sz w:val="24"/>
+          <w:szCs w:val="24"/>
+        </w:rPr>
+        <w:t>ENDERROR</w:t>
+      </w:r>
+      <w:r>
+        <w:rPr>
+          <w:rFonts w:asciiTheme="majorBidi" w:hAnsiTheme="majorBidi" w:cstheme="majorBidi"/>
+          <w:sz w:val="24"/>
+          <w:szCs w:val="24"/>
+        </w:rPr>
+        <w:t>[3] = 1, the fourth packet ending this cycle has an error.</w:t>
+      </w:r>
+    </w:p>
+    <w:p>
+      <w:pPr>
+        <w:spacing w:before="100" w:beforeAutospacing="1" w:after="100" w:afterAutospacing="1"/>
+        <w:ind w:left="360"/>
+        <w:rPr>
+          <w:rFonts w:asciiTheme="majorBidi" w:hAnsiTheme="majorBidi" w:cstheme="majorBidi"/>
+          <w:sz w:val="24"/>
+          <w:szCs w:val="24"/>
+        </w:rPr>
+      </w:pPr>
+      <w:r>
+        <w:rPr>
+          <w:rFonts w:asciiTheme="majorBidi" w:hAnsiTheme="majorBidi" w:cstheme="majorBidi"/>
+          <w:sz w:val="24"/>
+          <w:szCs w:val="24"/>
+        </w:rPr>
+        <w:t xml:space="preserve">The number of bits in </w:t>
+      </w:r>
+      <w:r>
+        <w:rPr>
+          <w:rFonts w:asciiTheme="majorBidi" w:hAnsiTheme="majorBidi" w:cstheme="majorBidi"/>
+          <w:b/>
+          <w:bCs/>
+          <w:sz w:val="24"/>
+          <w:szCs w:val="24"/>
+        </w:rPr>
+        <w:t xml:space="preserve">ENDERROR </w:t>
+      </w:r>
+      <w:r>
+        <w:rPr>
+          <w:rFonts w:asciiTheme="majorBidi" w:hAnsiTheme="majorBidi" w:cstheme="majorBidi"/>
+          <w:sz w:val="24"/>
+          <w:szCs w:val="24"/>
+        </w:rPr>
+        <w:t xml:space="preserve">is the number of bits in </w:t>
+      </w:r>
+      <w:r>
+        <w:rPr>
+          <w:rFonts w:asciiTheme="majorBidi" w:hAnsiTheme="majorBidi" w:cstheme="majorBidi"/>
+          <w:b/>
+          <w:bCs/>
+          <w:sz w:val="24"/>
+          <w:szCs w:val="24"/>
+        </w:rPr>
+        <w:t>END</w:t>
+      </w:r>
+      <w:r>
+        <w:rPr>
+          <w:rFonts w:asciiTheme="majorBidi" w:hAnsiTheme="majorBidi" w:cstheme="majorBidi"/>
+          <w:sz w:val="24"/>
+          <w:szCs w:val="24"/>
+        </w:rPr>
+        <w:t>.</w:t>
+      </w:r>
+    </w:p>
+    <w:p>
+      <w:pPr>
+        <w:spacing w:before="100" w:beforeAutospacing="1" w:after="100" w:afterAutospacing="1"/>
+        <w:ind w:left="360"/>
+        <w:rPr>
+          <w:rFonts w:asciiTheme="majorBidi" w:hAnsiTheme="majorBidi" w:cstheme="majorBidi"/>
+          <w:sz w:val="24"/>
+          <w:szCs w:val="24"/>
+        </w:rPr>
+      </w:pPr>
+      <w:r>
+        <w:rPr>
+          <w:rFonts w:asciiTheme="majorBidi" w:hAnsiTheme="majorBidi" w:cstheme="majorBidi"/>
+          <w:sz w:val="24"/>
+          <w:szCs w:val="24"/>
+        </w:rPr>
+        <w:t xml:space="preserve">If </w:t>
+      </w:r>
+      <w:r>
+        <w:rPr>
+          <w:rFonts w:asciiTheme="majorBidi" w:hAnsiTheme="majorBidi" w:cstheme="majorBidi"/>
+          <w:b/>
+          <w:bCs/>
+          <w:sz w:val="24"/>
+          <w:szCs w:val="24"/>
+        </w:rPr>
+        <w:t>ENDERROR</w:t>
+      </w:r>
+      <w:r>
+        <w:rPr>
+          <w:rFonts w:asciiTheme="majorBidi" w:hAnsiTheme="majorBidi" w:cstheme="majorBidi"/>
+          <w:sz w:val="24"/>
+          <w:szCs w:val="24"/>
+        </w:rPr>
+        <w:t xml:space="preserve">[N] is asserted, </w:t>
+      </w:r>
+      <w:r>
+        <w:rPr>
+          <w:rFonts w:asciiTheme="majorBidi" w:hAnsiTheme="majorBidi" w:cstheme="majorBidi"/>
+          <w:b/>
+          <w:bCs/>
+          <w:sz w:val="24"/>
+          <w:szCs w:val="24"/>
+        </w:rPr>
+        <w:t>END</w:t>
+      </w:r>
+      <w:r>
+        <w:rPr>
+          <w:rFonts w:asciiTheme="majorBidi" w:hAnsiTheme="majorBidi" w:cstheme="majorBidi"/>
+          <w:sz w:val="24"/>
+          <w:szCs w:val="24"/>
+        </w:rPr>
+        <w:t>[N] must be asserted.</w:t>
+      </w:r>
+    </w:p>
+    <w:p>
+      <w:pPr>
+        <w:spacing w:before="100" w:beforeAutospacing="1" w:after="100" w:afterAutospacing="1"/>
+        <w:ind w:left="360"/>
+        <w:rPr>
+          <w:rFonts w:asciiTheme="majorBidi" w:hAnsiTheme="majorBidi" w:cstheme="majorBidi"/>
+          <w:sz w:val="24"/>
+          <w:szCs w:val="24"/>
+        </w:rPr>
+      </w:pPr>
+      <w:r>
+        <w:rPr>
+          <w:rFonts w:asciiTheme="majorBidi" w:hAnsiTheme="majorBidi" w:cstheme="majorBidi"/>
+          <w:b/>
+          <w:bCs/>
+          <w:sz w:val="24"/>
+          <w:szCs w:val="24"/>
+        </w:rPr>
+        <w:t xml:space="preserve">END[N:0]PTR </w:t>
+      </w:r>
+      <w:r>
+        <w:rPr>
+          <w:rFonts w:asciiTheme="majorBidi" w:hAnsiTheme="majorBidi" w:cstheme="majorBidi"/>
+          <w:sz w:val="24"/>
+          <w:szCs w:val="24"/>
+        </w:rPr>
+        <w:t>This field is an array of pointers to the last 4 bytes of packets ending in this flit.</w:t>
+      </w:r>
+    </w:p>
+    <w:p>
+      <w:pPr>
+        <w:spacing w:before="100" w:beforeAutospacing="1" w:after="100" w:afterAutospacing="1"/>
+        <w:ind w:left="360"/>
+        <w:rPr>
+          <w:rFonts w:asciiTheme="majorBidi" w:hAnsiTheme="majorBidi" w:cstheme="majorBidi"/>
+          <w:sz w:val="24"/>
+          <w:szCs w:val="24"/>
+        </w:rPr>
+      </w:pPr>
+      <w:r>
+        <w:rPr>
+          <w:rFonts w:asciiTheme="majorBidi" w:hAnsiTheme="majorBidi" w:cstheme="majorBidi"/>
+          <w:sz w:val="24"/>
+          <w:szCs w:val="24"/>
+        </w:rPr>
+        <w:t xml:space="preserve">• There is one pointer for each </w:t>
+      </w:r>
+      <w:r>
+        <w:rPr>
+          <w:rFonts w:asciiTheme="majorBidi" w:hAnsiTheme="majorBidi" w:cstheme="majorBidi"/>
+          <w:b/>
+          <w:bCs/>
+          <w:sz w:val="24"/>
+          <w:szCs w:val="24"/>
+        </w:rPr>
+        <w:t xml:space="preserve">END </w:t>
+      </w:r>
+      <w:r>
+        <w:rPr>
+          <w:rFonts w:asciiTheme="majorBidi" w:hAnsiTheme="majorBidi" w:cstheme="majorBidi"/>
+          <w:sz w:val="24"/>
+          <w:szCs w:val="24"/>
+        </w:rPr>
+        <w:t xml:space="preserve">bit, valid only if that </w:t>
+      </w:r>
+      <w:r>
+        <w:rPr>
+          <w:rFonts w:asciiTheme="majorBidi" w:hAnsiTheme="majorBidi" w:cstheme="majorBidi"/>
+          <w:b/>
+          <w:bCs/>
+          <w:sz w:val="24"/>
+          <w:szCs w:val="24"/>
+        </w:rPr>
+        <w:t xml:space="preserve">END </w:t>
+      </w:r>
+      <w:r>
+        <w:rPr>
+          <w:rFonts w:asciiTheme="majorBidi" w:hAnsiTheme="majorBidi" w:cstheme="majorBidi"/>
+          <w:sz w:val="24"/>
+          <w:szCs w:val="24"/>
+        </w:rPr>
+        <w:t>bit is set.</w:t>
+      </w:r>
+    </w:p>
+    <w:p>
+      <w:pPr>
+        <w:spacing w:before="100" w:beforeAutospacing="1" w:after="100" w:afterAutospacing="1"/>
+        <w:ind w:left="360"/>
+        <w:rPr>
+          <w:rFonts w:asciiTheme="majorBidi" w:hAnsiTheme="majorBidi" w:cstheme="majorBidi"/>
+          <w:sz w:val="24"/>
+          <w:szCs w:val="24"/>
+        </w:rPr>
+      </w:pPr>
+      <w:r>
+        <w:rPr>
+          <w:rFonts w:asciiTheme="majorBidi" w:hAnsiTheme="majorBidi" w:cstheme="majorBidi"/>
+          <w:sz w:val="24"/>
+          <w:szCs w:val="24"/>
+        </w:rPr>
+        <w:t xml:space="preserve">• If the corresponding </w:t>
+      </w:r>
+      <w:r>
+        <w:rPr>
+          <w:rFonts w:asciiTheme="majorBidi" w:hAnsiTheme="majorBidi" w:cstheme="majorBidi"/>
+          <w:b/>
+          <w:bCs/>
+          <w:sz w:val="24"/>
+          <w:szCs w:val="24"/>
+        </w:rPr>
+        <w:t xml:space="preserve">END </w:t>
+      </w:r>
+      <w:r>
+        <w:rPr>
+          <w:rFonts w:asciiTheme="majorBidi" w:hAnsiTheme="majorBidi" w:cstheme="majorBidi"/>
+          <w:sz w:val="24"/>
+          <w:szCs w:val="24"/>
+        </w:rPr>
+        <w:t>bit is 0, the pointer can have any value and should be ignored.</w:t>
+      </w:r>
+    </w:p>
+    <w:p>
+      <w:pPr>
+        <w:spacing w:before="100" w:beforeAutospacing="1" w:after="100" w:afterAutospacing="1"/>
+        <w:ind w:left="360"/>
+        <w:rPr>
+          <w:rFonts w:asciiTheme="majorBidi" w:hAnsiTheme="majorBidi" w:cstheme="majorBidi"/>
+          <w:sz w:val="24"/>
+          <w:szCs w:val="24"/>
+        </w:rPr>
+      </w:pPr>
+      <w:r>
+        <w:rPr>
+          <w:rFonts w:asciiTheme="majorBidi" w:hAnsiTheme="majorBidi" w:cstheme="majorBidi"/>
+          <w:sz w:val="24"/>
+          <w:szCs w:val="24"/>
+        </w:rPr>
+        <w:t>• All packet ends are 4-byte aligned.</w:t>
+      </w:r>
+    </w:p>
+    <w:p>
+      <w:pPr>
+        <w:spacing w:before="100" w:beforeAutospacing="1" w:after="100" w:afterAutospacing="1"/>
+        <w:ind w:left="360"/>
+        <w:rPr>
+          <w:rFonts w:asciiTheme="majorBidi" w:hAnsiTheme="majorBidi" w:cstheme="majorBidi"/>
+          <w:sz w:val="24"/>
+          <w:szCs w:val="24"/>
+        </w:rPr>
+      </w:pPr>
+      <w:r>
+        <w:rPr>
+          <w:rFonts w:asciiTheme="majorBidi" w:hAnsiTheme="majorBidi" w:cstheme="majorBidi"/>
+          <w:sz w:val="24"/>
+          <w:szCs w:val="24"/>
+        </w:rPr>
+        <w:t>• The width of each pointer is log2(CXSDATAFLITWIDTH/32) bits.</w:t>
+      </w:r>
+    </w:p>
+    <w:p>
+      <w:pPr>
+        <w:spacing w:before="100" w:beforeAutospacing="1" w:after="100" w:afterAutospacing="1"/>
+        <w:ind w:left="360"/>
+        <w:rPr>
+          <w:rFonts w:asciiTheme="majorBidi" w:hAnsiTheme="majorBidi" w:cstheme="majorBidi"/>
+          <w:sz w:val="24"/>
+          <w:szCs w:val="24"/>
+        </w:rPr>
+      </w:pPr>
+      <w:r>
+        <w:rPr>
+          <w:rFonts w:asciiTheme="majorBidi" w:hAnsiTheme="majorBidi" w:cstheme="majorBidi"/>
+          <w:sz w:val="24"/>
+          <w:szCs w:val="24"/>
+        </w:rPr>
+        <w:t>• Each end pointer points to the first byte of the last aligned 4 bytes of the packet.</w:t>
+      </w:r>
+    </w:p>
+    <w:p>
+      <w:pPr>
+        <w:spacing w:before="100" w:beforeAutospacing="1" w:after="100" w:afterAutospacing="1"/>
+        <w:ind w:left="360"/>
+        <w:rPr>
+          <w:rFonts w:asciiTheme="majorBidi" w:hAnsiTheme="majorBidi" w:cstheme="majorBidi"/>
+          <w:sz w:val="24"/>
+          <w:szCs w:val="24"/>
+        </w:rPr>
+      </w:pPr>
+      <w:r>
+        <w:rPr>
+          <w:rFonts w:asciiTheme="majorBidi" w:hAnsiTheme="majorBidi" w:cstheme="majorBidi"/>
+          <w:sz w:val="24"/>
+          <w:szCs w:val="24"/>
+        </w:rPr>
+        <w:t>• The last byte of the Xth ending packet is therefore ((</w:t>
+      </w:r>
+      <w:r>
+        <w:rPr>
+          <w:rFonts w:asciiTheme="majorBidi" w:hAnsiTheme="majorBidi" w:cstheme="majorBidi"/>
+          <w:b/>
+          <w:bCs/>
+          <w:sz w:val="24"/>
+          <w:szCs w:val="24"/>
+        </w:rPr>
+        <w:t>END</w:t>
+      </w:r>
+      <w:r>
+        <w:rPr>
+          <w:rFonts w:asciiTheme="majorBidi" w:hAnsiTheme="majorBidi" w:cstheme="majorBidi"/>
+          <w:sz w:val="24"/>
+          <w:szCs w:val="24"/>
+        </w:rPr>
+        <w:t>[X]</w:t>
+      </w:r>
+      <w:r>
+        <w:rPr>
+          <w:rFonts w:asciiTheme="majorBidi" w:hAnsiTheme="majorBidi" w:cstheme="majorBidi"/>
+          <w:b/>
+          <w:bCs/>
+          <w:sz w:val="24"/>
+          <w:szCs w:val="24"/>
+        </w:rPr>
+        <w:t xml:space="preserve">PTR </w:t>
+      </w:r>
+      <w:r>
+        <w:rPr>
+          <w:rFonts w:asciiTheme="majorBidi" w:hAnsiTheme="majorBidi" w:cstheme="majorBidi"/>
+          <w:sz w:val="24"/>
+          <w:szCs w:val="24"/>
+        </w:rPr>
+        <w:t>&lt;&lt; 2)+3).</w:t>
+      </w:r>
+    </w:p>
+    <w:p>
+      <w:pPr>
+        <w:spacing w:before="100" w:beforeAutospacing="1" w:after="100" w:afterAutospacing="1"/>
+        <w:ind w:left="360"/>
+        <w:rPr>
+          <w:rFonts w:asciiTheme="majorBidi" w:hAnsiTheme="majorBidi" w:cstheme="majorBidi"/>
+          <w:sz w:val="24"/>
+          <w:szCs w:val="24"/>
+        </w:rPr>
+      </w:pPr>
+      <w:r>
+        <w:rPr>
+          <w:rFonts w:asciiTheme="majorBidi" w:hAnsiTheme="majorBidi" w:cstheme="majorBidi"/>
+          <w:sz w:val="24"/>
+          <w:szCs w:val="24"/>
+        </w:rPr>
+        <w:t>• Valid end pointers are defined to be monotonically increasing, for example if two packets end</w:t>
+      </w:r>
+    </w:p>
+    <w:p>
+      <w:pPr>
+        <w:spacing w:before="100" w:beforeAutospacing="1" w:after="100" w:afterAutospacing="1"/>
+        <w:ind w:left="360"/>
+        <w:rPr>
+          <w:rFonts w:asciiTheme="majorBidi" w:hAnsiTheme="majorBidi" w:cstheme="majorBidi"/>
+          <w:sz w:val="24"/>
+          <w:szCs w:val="24"/>
+        </w:rPr>
+      </w:pPr>
+      <w:r>
+        <w:rPr>
+          <w:rFonts w:asciiTheme="majorBidi" w:hAnsiTheme="majorBidi" w:cstheme="majorBidi"/>
+          <w:sz w:val="24"/>
+          <w:szCs w:val="24"/>
+        </w:rPr>
+        <w:t xml:space="preserve">in this flit then </w:t>
+      </w:r>
+      <w:r>
+        <w:rPr>
+          <w:rFonts w:asciiTheme="majorBidi" w:hAnsiTheme="majorBidi" w:cstheme="majorBidi"/>
+          <w:b/>
+          <w:bCs/>
+          <w:sz w:val="24"/>
+          <w:szCs w:val="24"/>
+        </w:rPr>
+        <w:t xml:space="preserve">END1PTR </w:t>
+      </w:r>
+      <w:r>
+        <w:rPr>
+          <w:rFonts w:asciiTheme="majorBidi" w:hAnsiTheme="majorBidi" w:cstheme="majorBidi"/>
+          <w:sz w:val="24"/>
+          <w:szCs w:val="24"/>
+        </w:rPr>
+        <w:t xml:space="preserve">must be greater than </w:t>
+      </w:r>
+      <w:r>
+        <w:rPr>
+          <w:rFonts w:asciiTheme="majorBidi" w:hAnsiTheme="majorBidi" w:cstheme="majorBidi"/>
+          <w:b/>
+          <w:bCs/>
+          <w:sz w:val="24"/>
+          <w:szCs w:val="24"/>
+        </w:rPr>
+        <w:t>END0PTR</w:t>
+      </w:r>
+      <w:r>
+        <w:rPr>
+          <w:rFonts w:asciiTheme="majorBidi" w:hAnsiTheme="majorBidi" w:cstheme="majorBidi"/>
+          <w:sz w:val="24"/>
+          <w:szCs w:val="24"/>
+        </w:rPr>
+        <w:t>.</w:t>
+      </w:r>
+    </w:p>
+    <w:p>
+      <w:pPr>
+        <w:spacing w:before="100" w:beforeAutospacing="1" w:after="100" w:afterAutospacing="1"/>
+        <w:ind w:left="360"/>
+        <w:rPr>
+          <w:rFonts w:asciiTheme="majorBidi" w:hAnsiTheme="majorBidi" w:cstheme="majorBidi"/>
+          <w:b/>
+          <w:bCs/>
+          <w:sz w:val="24"/>
+          <w:szCs w:val="24"/>
+        </w:rPr>
+      </w:pPr>
+      <w:r>
+        <w:rPr>
+          <w:rFonts w:asciiTheme="majorBidi" w:hAnsiTheme="majorBidi" w:cstheme="majorBidi"/>
+          <w:b/>
+          <w:bCs/>
+          <w:sz w:val="24"/>
+          <w:szCs w:val="24"/>
+        </w:rPr>
+        <w:t>Note</w:t>
+      </w:r>
+    </w:p>
+    <w:p>
+      <w:pPr>
+        <w:spacing w:before="100" w:beforeAutospacing="1" w:after="100" w:afterAutospacing="1"/>
+        <w:ind w:left="360"/>
+        <w:rPr>
+          <w:rFonts w:asciiTheme="majorBidi" w:hAnsiTheme="majorBidi" w:cstheme="majorBidi"/>
+          <w:sz w:val="24"/>
+          <w:szCs w:val="24"/>
+        </w:rPr>
+      </w:pPr>
+      <w:r>
+        <w:rPr>
+          <w:rFonts w:asciiTheme="majorBidi" w:hAnsiTheme="majorBidi" w:cstheme="majorBidi"/>
+          <w:b/>
+          <w:bCs/>
+          <w:sz w:val="24"/>
+          <w:szCs w:val="24"/>
+        </w:rPr>
+        <w:t>START</w:t>
+      </w:r>
+      <w:r>
+        <w:rPr>
+          <w:rFonts w:asciiTheme="majorBidi" w:hAnsiTheme="majorBidi" w:cstheme="majorBidi"/>
+          <w:sz w:val="24"/>
+          <w:szCs w:val="24"/>
+        </w:rPr>
+        <w:t>[X]</w:t>
+      </w:r>
+      <w:r>
+        <w:rPr>
+          <w:rFonts w:asciiTheme="majorBidi" w:hAnsiTheme="majorBidi" w:cstheme="majorBidi"/>
+          <w:b/>
+          <w:bCs/>
+          <w:sz w:val="24"/>
+          <w:szCs w:val="24"/>
+        </w:rPr>
+        <w:t xml:space="preserve">PTR </w:t>
+      </w:r>
+      <w:r>
+        <w:rPr>
+          <w:rFonts w:asciiTheme="majorBidi" w:hAnsiTheme="majorBidi" w:cstheme="majorBidi"/>
+          <w:sz w:val="24"/>
+          <w:szCs w:val="24"/>
+        </w:rPr>
+        <w:t xml:space="preserve">and </w:t>
+      </w:r>
+      <w:r>
+        <w:rPr>
+          <w:rFonts w:asciiTheme="majorBidi" w:hAnsiTheme="majorBidi" w:cstheme="majorBidi"/>
+          <w:b/>
+          <w:bCs/>
+          <w:sz w:val="24"/>
+          <w:szCs w:val="24"/>
+        </w:rPr>
+        <w:t>END</w:t>
+      </w:r>
+      <w:r>
+        <w:rPr>
+          <w:rFonts w:asciiTheme="majorBidi" w:hAnsiTheme="majorBidi" w:cstheme="majorBidi"/>
+          <w:sz w:val="24"/>
+          <w:szCs w:val="24"/>
+        </w:rPr>
+        <w:t>[X]</w:t>
+      </w:r>
+      <w:r>
+        <w:rPr>
+          <w:rFonts w:asciiTheme="majorBidi" w:hAnsiTheme="majorBidi" w:cstheme="majorBidi"/>
+          <w:b/>
+          <w:bCs/>
+          <w:sz w:val="24"/>
+          <w:szCs w:val="24"/>
+        </w:rPr>
+        <w:t xml:space="preserve">PTR </w:t>
+      </w:r>
+      <w:r>
+        <w:rPr>
+          <w:rFonts w:asciiTheme="majorBidi" w:hAnsiTheme="majorBidi" w:cstheme="majorBidi"/>
+          <w:sz w:val="24"/>
+          <w:szCs w:val="24"/>
+        </w:rPr>
+        <w:t>might not point to the same packet, for example if a packet</w:t>
+      </w:r>
+    </w:p>
+    <w:p>
+      <w:pPr>
+        <w:spacing w:before="100" w:beforeAutospacing="1" w:after="100" w:afterAutospacing="1"/>
+        <w:ind w:left="360"/>
+        <w:rPr>
+          <w:rFonts w:asciiTheme="majorBidi" w:hAnsiTheme="majorBidi" w:cstheme="majorBidi"/>
+          <w:sz w:val="24"/>
+          <w:szCs w:val="24"/>
+        </w:rPr>
+      </w:pPr>
+      <w:r>
+        <w:rPr>
+          <w:rFonts w:asciiTheme="majorBidi" w:hAnsiTheme="majorBidi" w:cstheme="majorBidi"/>
+          <w:sz w:val="24"/>
+          <w:szCs w:val="24"/>
+        </w:rPr>
+        <w:t>started in a previous flit.</w:t>
+      </w:r>
+    </w:p>
+    <w:p>
+      <w:pPr>
+        <w:spacing w:line="360" w:lineRule="auto"/>
+        <w:rPr>
+          <w:rFonts w:asciiTheme="majorBidi" w:hAnsiTheme="majorBidi" w:cstheme="majorBidi"/>
+          <w:sz w:val="24"/>
+          <w:szCs w:val="24"/>
+        </w:rPr>
+      </w:pPr>
+      <w:r>
+        <w:rPr>
+          <w:rFonts w:asciiTheme="majorBidi" w:hAnsiTheme="majorBidi" w:cstheme="majorBidi"/>
+          <w:sz w:val="24"/>
+          <w:szCs w:val="24"/>
+        </w:rPr>
+        <w:lastRenderedPageBreak/>
         <w:pict w14:anchorId="5727298A">
           <v:rect id="_x0000_i1040" style="width:0;height:1.5pt" o:hralign="center" o:hrstd="t" o:hr="t" fillcolor="#a0a0a0" stroked="f"/>
         </w:pict>
@@ -12616,28 +14649,19 @@
       </w:pPr>
       <w:bookmarkStart w:id="27" w:name="_Toc236515836"/>
       <w:r>
-        <w:rPr>
-          <w:b/>
-          <w:bCs/>
-        </w:rPr>
         <w:t>3.5 Packet Encoder</w:t>
       </w:r>
       <w:bookmarkEnd w:id="27"/>
     </w:p>
     <w:p>
-      <w:pPr>
-        <w:framePr w:w="9673" w:h="0" w:hSpace="180" w:vSpace="120" w:wrap="around" w:vAnchor="text" w:hAnchor="margin" w:xAlign="center" w:y="1"/>
-        <w:jc w:val="center"/>
-      </w:pPr>
       <w:r>
         <w:rPr>
           <w:noProof/>
         </w:rPr>
-        <w:lastRenderedPageBreak/>
         <w:drawing>
-          <wp:inline distT="0" distB="0" distL="0" distR="0" wp14:anchorId="6F7B697B" wp14:editId="6C8A92E9">
-            <wp:extent cx="6066667" cy="2666667"/>
-            <wp:effectExtent l="0" t="0" r="0" b="635"/>
+          <wp:inline distT="0" distB="0" distL="0" distR="0" wp14:anchorId="03F4FE31" wp14:editId="4B1FD8A0">
+            <wp:extent cx="6065980" cy="2423160"/>
+            <wp:effectExtent l="0" t="0" r="0" b="0"/>
             <wp:docPr id="551721641" name="Picture 1"/>
             <wp:cNvGraphicFramePr>
               <a:graphicFrameLocks xmlns:a="http://schemas.openxmlformats.org/drawingml/2006/main" noChangeAspect="1"/>
@@ -12658,7 +14682,7 @@
                   <pic:spPr>
                     <a:xfrm>
                       <a:off x="0" y="0"/>
-                      <a:ext cx="6066667" cy="2666667"/>
+                      <a:ext cx="6068047" cy="2423986"/>
                     </a:xfrm>
                     <a:prstGeom prst="rect">
                       <a:avLst/>
@@ -12674,7 +14698,6 @@
     <w:p>
       <w:pPr>
         <w:pStyle w:val="Caption"/>
-        <w:framePr w:w="9673" w:h="0" w:hSpace="180" w:vSpace="120" w:wrap="around" w:vAnchor="text" w:hAnchor="margin" w:xAlign="center" w:y="1"/>
         <w:jc w:val="center"/>
       </w:pPr>
       <w:bookmarkStart w:id="28" w:name="_Toc236515863"/>
@@ -12706,6 +14729,11 @@
         <w:t xml:space="preserve"> - Packet Encoder block diagram</w:t>
       </w:r>
       <w:bookmarkEnd w:id="28"/>
+    </w:p>
+    <w:p>
+      <w:pPr>
+        <w:pStyle w:val="Heading2"/>
+      </w:pPr>
     </w:p>
     <w:p>
       <w:pPr>
@@ -16302,23 +18330,50 @@
     </w:p>
     <w:p>
       <w:pPr>
-        <w:pStyle w:val="Heading1"/>
-      </w:pPr>
-      <w:bookmarkStart w:id="34" w:name="_Toc236515841"/>
-      <w:r>
         <w:rPr>
           <w:b/>
           <w:bCs/>
-        </w:rPr>
+          <w:color w:val="2E74B5"/>
+          <w:sz w:val="32"/>
+          <w:szCs w:val="32"/>
+        </w:rPr>
+      </w:pPr>
+      <w:bookmarkStart w:id="34" w:name="_Toc236515841"/>
+      <w:r>
+        <w:rPr>
+          <w:b/>
+          <w:bCs/>
+        </w:rPr>
+        <w:br w:type="page"/>
+      </w:r>
+    </w:p>
+    <w:p>
+      <w:pPr>
+        <w:pStyle w:val="Heading1"/>
+      </w:pPr>
+      <w:r>
+        <w:rPr>
+          <w:b/>
+          <w:bCs/>
+        </w:rPr>
+        <w:lastRenderedPageBreak/>
         <w:t>5 Control Unit</w:t>
       </w:r>
       <w:bookmarkEnd w:id="34"/>
     </w:p>
     <w:p>
       <w:pPr>
-        <w:framePr w:w="5736" w:h="0" w:hSpace="180" w:vSpace="120" w:wrap="around" w:vAnchor="text" w:hAnchor="margin" w:y="1"/>
+        <w:framePr w:w="5736" w:h="0" w:hSpace="180" w:vSpace="120" w:wrap="around" w:vAnchor="text" w:hAnchor="page" w:x="621" w:y="183"/>
         <w:jc w:val="center"/>
       </w:pPr>
+    </w:p>
+    <w:p>
+      <w:pPr>
+        <w:pStyle w:val="Caption"/>
+        <w:framePr w:w="5736" w:h="0" w:hSpace="180" w:vSpace="120" w:wrap="around" w:vAnchor="text" w:hAnchor="page" w:x="621" w:y="183"/>
+        <w:jc w:val="center"/>
+      </w:pPr>
+      <w:bookmarkStart w:id="35" w:name="_Toc236515865"/>
       <w:r>
         <w:rPr>
           <w:rFonts w:asciiTheme="majorBidi" w:hAnsiTheme="majorBidi" w:cstheme="majorBidi"/>
@@ -16326,9 +18381,8 @@
           <w:sz w:val="24"/>
           <w:szCs w:val="24"/>
         </w:rPr>
-        <w:lastRenderedPageBreak/>
         <w:drawing>
-          <wp:inline distT="0" distB="0" distL="114300" distR="114300" wp14:anchorId="2FABFB7C" wp14:editId="73DB8754">
+          <wp:inline distT="0" distB="0" distL="114300" distR="114300" wp14:anchorId="5056245E" wp14:editId="13BE14ED">
             <wp:extent cx="3566160" cy="4762500"/>
             <wp:effectExtent l="0" t="0" r="0" b="0"/>
             <wp:docPr id="1815391365" name="Picture 1"/>
@@ -16373,10 +18427,9 @@
     <w:p>
       <w:pPr>
         <w:pStyle w:val="Caption"/>
-        <w:framePr w:w="5736" w:h="0" w:hSpace="180" w:vSpace="120" w:wrap="around" w:vAnchor="text" w:hAnchor="margin" w:y="1"/>
+        <w:framePr w:w="5736" w:h="0" w:hSpace="180" w:vSpace="120" w:wrap="around" w:vAnchor="text" w:hAnchor="page" w:x="621" w:y="183"/>
         <w:jc w:val="center"/>
       </w:pPr>
-      <w:bookmarkStart w:id="35" w:name="_Toc236515865"/>
       <w:r>
         <w:t xml:space="preserve">Figure </w:t>
       </w:r>
@@ -16472,6 +18525,28 @@
         <w:jc w:val="center"/>
         <w:rPr>
           <w:rFonts w:asciiTheme="majorBidi" w:hAnsiTheme="majorBidi" w:cstheme="majorBidi"/>
+          <w:sz w:val="24"/>
+          <w:szCs w:val="24"/>
+        </w:rPr>
+      </w:pPr>
+    </w:p>
+    <w:p>
+      <w:pPr>
+        <w:rPr>
+          <w:rFonts w:asciiTheme="majorBidi" w:hAnsiTheme="majorBidi" w:cstheme="majorBidi"/>
+          <w:b/>
+          <w:bCs/>
+          <w:sz w:val="24"/>
+          <w:szCs w:val="24"/>
+        </w:rPr>
+      </w:pPr>
+    </w:p>
+    <w:p>
+      <w:pPr>
+        <w:rPr>
+          <w:rFonts w:asciiTheme="majorBidi" w:hAnsiTheme="majorBidi" w:cstheme="majorBidi"/>
+          <w:b/>
+          <w:bCs/>
           <w:sz w:val="24"/>
           <w:szCs w:val="24"/>
         </w:rPr>
@@ -17982,6 +20057,7 @@
                 <w:sz w:val="24"/>
                 <w:szCs w:val="24"/>
               </w:rPr>
+              <w:lastRenderedPageBreak/>
               <w:t>addr_out</w:t>
             </w:r>
           </w:p>
@@ -18101,7 +20177,6 @@
                 <w:sz w:val="24"/>
                 <w:szCs w:val="24"/>
               </w:rPr>
-              <w:lastRenderedPageBreak/>
               <w:t>data_out</w:t>
             </w:r>
           </w:p>
@@ -18253,7 +20328,7 @@
                 <w:sz w:val="24"/>
                 <w:szCs w:val="24"/>
               </w:rPr>
-              <w:t>Output</w:t>
+              <w:t>Input</w:t>
             </w:r>
           </w:p>
         </w:tc>
@@ -18749,6 +20824,7 @@
           <w:sz w:val="24"/>
           <w:szCs w:val="24"/>
         </w:rPr>
+        <w:lastRenderedPageBreak/>
         <w:t>Since Configuration and Data TLPs may contain different numbers of payload words, the counter output is compared against a phase-dependent expected payload count. Separate comparators are used to determine packet completion according to the active packet type.</w:t>
       </w:r>
     </w:p>
@@ -18830,7 +20906,6 @@
           <w:sz w:val="24"/>
           <w:szCs w:val="24"/>
         </w:rPr>
-        <w:lastRenderedPageBreak/>
         <w:t xml:space="preserve">Provides the current payload word count to the Control Unit. </w:t>
       </w:r>
     </w:p>
@@ -19611,6 +21686,7 @@
                 <w:sz w:val="24"/>
                 <w:szCs w:val="32"/>
               </w:rPr>
+              <w:lastRenderedPageBreak/>
               <w:t>Word N</w:t>
             </w:r>
           </w:p>
@@ -19732,7 +21808,6 @@
                 <w:color w:val="000000"/>
                 <w:sz w:val="24"/>
               </w:rPr>
-              <w:lastRenderedPageBreak/>
               <w:t>Field Name</w:t>
             </w:r>
           </w:p>
@@ -19805,21 +21880,21 @@
             <w:r>
               <w:rPr>
                 <w:rFonts w:asciiTheme="majorBidi" w:hAnsiTheme="majorBidi" w:cstheme="majorBidi"/>
-                <w:color w:val="000000" w:themeColor="text1"/>
-                <w:sz w:val="24"/>
-                <w:szCs w:val="24"/>
-              </w:rPr>
-              <w:t>RSV</w:t>
-            </w:r>
-            <w:r>
-              <w:rPr>
-                <w:rFonts w:asciiTheme="majorBidi" w:hAnsiTheme="majorBidi" w:cstheme="majorBidi"/>
-                <w:color w:val="000000" w:themeColor="text1"/>
-                <w:sz w:val="24"/>
-                <w:szCs w:val="24"/>
-              </w:rPr>
-              <w:br/>
-            </w:r>
+                <w:sz w:val="24"/>
+                <w:szCs w:val="32"/>
+              </w:rPr>
+              <w:t>BASE_ADDR</w:t>
+            </w:r>
+          </w:p>
+          <w:p>
+            <w:pPr>
+              <w:spacing w:before="80" w:after="80"/>
+              <w:rPr>
+                <w:rFonts w:asciiTheme="majorBidi" w:hAnsiTheme="majorBidi" w:cstheme="majorBidi"/>
+                <w:sz w:val="24"/>
+                <w:szCs w:val="32"/>
+              </w:rPr>
+            </w:pPr>
           </w:p>
         </w:tc>
         <w:tc>
@@ -19868,7 +21943,25 @@
                 <w:sz w:val="24"/>
                 <w:szCs w:val="24"/>
               </w:rPr>
-              <w:t xml:space="preserve">Reserved for future use </w:t>
+              <w:t>Configured by software according to device count</w:t>
+            </w:r>
+            <w:r>
+              <w:rPr>
+                <w:rFonts w:asciiTheme="majorBidi" w:hAnsiTheme="majorBidi" w:cstheme="majorBidi"/>
+                <w:color w:val="000000" w:themeColor="text1"/>
+                <w:sz w:val="24"/>
+                <w:szCs w:val="24"/>
+              </w:rPr>
+              <w:t xml:space="preserve"> next used by atu for address calculations</w:t>
+            </w:r>
+            <w:r>
+              <w:rPr>
+                <w:rFonts w:asciiTheme="majorBidi" w:hAnsiTheme="majorBidi" w:cstheme="majorBidi"/>
+                <w:color w:val="000000" w:themeColor="text1"/>
+                <w:sz w:val="24"/>
+                <w:szCs w:val="24"/>
+              </w:rPr>
+              <w:t xml:space="preserve"> </w:t>
             </w:r>
           </w:p>
         </w:tc>
@@ -20797,6 +22890,46 @@
     </w:p>
     <w:p>
       <w:pPr>
+        <w:spacing w:after="240"/>
+        <w:rPr>
+          <w:rFonts w:asciiTheme="majorBidi" w:hAnsiTheme="majorBidi" w:cstheme="majorBidi"/>
+        </w:rPr>
+      </w:pPr>
+    </w:p>
+    <w:p>
+      <w:pPr>
+        <w:spacing w:after="240"/>
+        <w:rPr>
+          <w:rFonts w:asciiTheme="majorBidi" w:hAnsiTheme="majorBidi" w:cstheme="majorBidi"/>
+        </w:rPr>
+      </w:pPr>
+    </w:p>
+    <w:p>
+      <w:pPr>
+        <w:spacing w:after="240"/>
+        <w:rPr>
+          <w:rFonts w:asciiTheme="majorBidi" w:hAnsiTheme="majorBidi" w:cstheme="majorBidi"/>
+        </w:rPr>
+      </w:pPr>
+    </w:p>
+    <w:p>
+      <w:pPr>
+        <w:spacing w:after="240"/>
+        <w:rPr>
+          <w:rFonts w:asciiTheme="majorBidi" w:hAnsiTheme="majorBidi" w:cstheme="majorBidi"/>
+        </w:rPr>
+      </w:pPr>
+    </w:p>
+    <w:p>
+      <w:pPr>
+        <w:spacing w:after="240"/>
+        <w:rPr>
+          <w:rFonts w:asciiTheme="majorBidi" w:hAnsiTheme="majorBidi" w:cstheme="majorBidi"/>
+        </w:rPr>
+      </w:pPr>
+    </w:p>
+    <w:p>
+      <w:pPr>
         <w:pStyle w:val="Heading3"/>
         <w:rPr>
           <w:rFonts w:asciiTheme="majorBidi" w:hAnsiTheme="majorBidi" w:cstheme="majorBidi"/>
@@ -20953,7 +23086,39 @@
                 <w:sz w:val="24"/>
                 <w:szCs w:val="32"/>
               </w:rPr>
-              <w:t>[31:16]</w:t>
+              <w:t>[</w:t>
+            </w:r>
+            <w:r>
+              <w:rPr>
+                <w:rFonts w:asciiTheme="majorBidi" w:hAnsiTheme="majorBidi" w:cstheme="majorBidi"/>
+                <w:sz w:val="24"/>
+                <w:szCs w:val="32"/>
+              </w:rPr>
+              <w:t>15</w:t>
+            </w:r>
+            <w:r>
+              <w:rPr>
+                <w:rFonts w:asciiTheme="majorBidi" w:hAnsiTheme="majorBidi" w:cstheme="majorBidi"/>
+                <w:sz w:val="24"/>
+                <w:szCs w:val="32"/>
+              </w:rPr>
+              <w:t>:</w:t>
+            </w:r>
+            <w:r>
+              <w:rPr>
+                <w:rFonts w:asciiTheme="majorBidi" w:hAnsiTheme="majorBidi" w:cstheme="majorBidi"/>
+                <w:sz w:val="24"/>
+                <w:szCs w:val="32"/>
+              </w:rPr>
+              <w:t>0</w:t>
+            </w:r>
+            <w:r>
+              <w:rPr>
+                <w:rFonts w:asciiTheme="majorBidi" w:hAnsiTheme="majorBidi" w:cstheme="majorBidi"/>
+                <w:sz w:val="24"/>
+                <w:szCs w:val="32"/>
+              </w:rPr>
+              <w:t>]</w:t>
             </w:r>
           </w:p>
         </w:tc>
@@ -21030,7 +23195,39 @@
                 <w:sz w:val="24"/>
                 <w:szCs w:val="32"/>
               </w:rPr>
-              <w:t>[15:0]</w:t>
+              <w:t>[</w:t>
+            </w:r>
+            <w:r>
+              <w:rPr>
+                <w:rFonts w:asciiTheme="majorBidi" w:hAnsiTheme="majorBidi" w:cstheme="majorBidi"/>
+                <w:sz w:val="24"/>
+                <w:szCs w:val="32"/>
+              </w:rPr>
+              <w:t>31</w:t>
+            </w:r>
+            <w:r>
+              <w:rPr>
+                <w:rFonts w:asciiTheme="majorBidi" w:hAnsiTheme="majorBidi" w:cstheme="majorBidi"/>
+                <w:sz w:val="24"/>
+                <w:szCs w:val="32"/>
+              </w:rPr>
+              <w:t>:</w:t>
+            </w:r>
+            <w:r>
+              <w:rPr>
+                <w:rFonts w:asciiTheme="majorBidi" w:hAnsiTheme="majorBidi" w:cstheme="majorBidi"/>
+                <w:sz w:val="24"/>
+                <w:szCs w:val="32"/>
+              </w:rPr>
+              <w:t>16</w:t>
+            </w:r>
+            <w:r>
+              <w:rPr>
+                <w:rFonts w:asciiTheme="majorBidi" w:hAnsiTheme="majorBidi" w:cstheme="majorBidi"/>
+                <w:sz w:val="24"/>
+                <w:szCs w:val="32"/>
+              </w:rPr>
+              <w:t>]</w:t>
             </w:r>
           </w:p>
         </w:tc>
@@ -21100,7 +23297,7 @@
           <w:szCs w:val="24"/>
         </w:rPr>
         <w:drawing>
-          <wp:inline distT="0" distB="0" distL="114300" distR="114300" wp14:anchorId="47E3A610" wp14:editId="03669A18">
+          <wp:inline distT="0" distB="0" distL="114300" distR="114300" wp14:anchorId="47E3A610" wp14:editId="4EBB4247">
             <wp:extent cx="2562225" cy="2343150"/>
             <wp:effectExtent l="0" t="0" r="9525" b="0"/>
             <wp:docPr id="1768509730" name="Picture 1768509730"/>

</xml_diff>

<commit_message>
working version of project
</commit_message>
<xml_diff>
--- a/Documentation/CXS_Bridge_Architecture_Spec_cleaned.docx
+++ b/Documentation/CXS_Bridge_Architecture_Spec_cleaned.docx
@@ -21426,7 +21426,7 @@
                 <w:sz w:val="24"/>
                 <w:szCs w:val="32"/>
               </w:rPr>
-              <w:t>ADDR_MODE [16], DEV_COUNT [15:8], ENC_MODE [7:4], PARITY_MODE [3:2], SYS_STATE [1:0]</w:t>
+              <w:t>BASE_ADDR [31:16], DEV_COUNT [15:8], ENC_MODE [7:4], ADDR_MODE [3], PARITY_MODE [2], SYS_STATE [1:0]</w:t>
             </w:r>
           </w:p>
         </w:tc>
@@ -21943,7 +21943,7 @@
                 <w:sz w:val="24"/>
                 <w:szCs w:val="24"/>
               </w:rPr>
-              <w:t>Configured by software according to device count</w:t>
+              <w:t>Base address for CDM translation. Not hardcoded in the design: software supplies it in this header field during the Configuration phase, and the ATU latches it and adds it to every payload address during the Transfer phase.</w:t>
             </w:r>
             <w:r>
               <w:rPr>
@@ -21952,7 +21952,6 @@
                 <w:sz w:val="24"/>
                 <w:szCs w:val="24"/>
               </w:rPr>
-              <w:t xml:space="preserve"> next used by atu for address calculations</w:t>
             </w:r>
             <w:r>
               <w:rPr>
@@ -21961,7 +21960,6 @@
                 <w:sz w:val="24"/>
                 <w:szCs w:val="24"/>
               </w:rPr>
-              <w:t xml:space="preserve"> </w:t>
             </w:r>
           </w:p>
         </w:tc>
@@ -21990,7 +21988,7 @@
                 <w:sz w:val="24"/>
                 <w:szCs w:val="32"/>
               </w:rPr>
-              <w:t>ADDR_MODE</w:t>
+              <w:t>DEV_COUNT</w:t>
             </w:r>
           </w:p>
         </w:tc>
@@ -22014,7 +22012,7 @@
                 <w:sz w:val="24"/>
                 <w:szCs w:val="32"/>
               </w:rPr>
-              <w:t>[16]</w:t>
+              <w:t>[15:8]</w:t>
             </w:r>
           </w:p>
         </w:tc>
@@ -22038,7 +22036,7 @@
                 <w:sz w:val="24"/>
                 <w:szCs w:val="32"/>
               </w:rPr>
-              <w:t>Address Mode selector (0 = Direct 16-bit addressing, 1 = Extended / Paged addressing).</w:t>
+              <w:t>Device Count indicator (Specifies the number of attached configurable device words, up to 256).</w:t>
             </w:r>
           </w:p>
         </w:tc>
@@ -22067,7 +22065,7 @@
                 <w:sz w:val="24"/>
                 <w:szCs w:val="32"/>
               </w:rPr>
-              <w:t>DEV_COUNT</w:t>
+              <w:t>ENC_MODE</w:t>
             </w:r>
           </w:p>
         </w:tc>
@@ -22091,7 +22089,7 @@
                 <w:sz w:val="24"/>
                 <w:szCs w:val="32"/>
               </w:rPr>
-              <w:t>[15:8]</w:t>
+              <w:t>[7:4]</w:t>
             </w:r>
           </w:p>
         </w:tc>
@@ -22115,7 +22113,7 @@
                 <w:sz w:val="24"/>
                 <w:szCs w:val="32"/>
               </w:rPr>
-              <w:t>Device Count indicator (Specifies the number of attached configurable device words, up to 256).</w:t>
+              <w:t>Encryption Mode setting (Defines cipher mode: e.g., AES-128, AES-256, Bypass, Custom).</w:t>
             </w:r>
           </w:p>
         </w:tc>
@@ -22144,7 +22142,7 @@
                 <w:sz w:val="24"/>
                 <w:szCs w:val="32"/>
               </w:rPr>
-              <w:t>ENC_MODE</w:t>
+              <w:t>ADDR_MODE</w:t>
             </w:r>
           </w:p>
         </w:tc>
@@ -22168,7 +22166,7 @@
                 <w:sz w:val="24"/>
                 <w:szCs w:val="32"/>
               </w:rPr>
-              <w:t>[7:4]</w:t>
+              <w:t>[3]</w:t>
             </w:r>
           </w:p>
         </w:tc>
@@ -22192,7 +22190,7 @@
                 <w:sz w:val="24"/>
                 <w:szCs w:val="32"/>
               </w:rPr>
-              <w:t>Encryption Mode setting (Defines cipher mode: e.g., AES-128, AES-256, Bypass, Custom).</w:t>
+              <w:t>Address Mode selector (0 = Direct 16-bit addressing, 1 = Extended / Paged addressing).</w:t>
             </w:r>
           </w:p>
         </w:tc>
@@ -22245,7 +22243,7 @@
                 <w:sz w:val="24"/>
                 <w:szCs w:val="32"/>
               </w:rPr>
-              <w:t>[3:2]</w:t>
+              <w:t>[2]</w:t>
             </w:r>
           </w:p>
         </w:tc>
@@ -22269,7 +22267,7 @@
                 <w:sz w:val="24"/>
                 <w:szCs w:val="32"/>
               </w:rPr>
-              <w:t>Parity Mode selection (00 = Disabled, 01 = Even Parity, 10 = Odd Parity, 11 = Reserved).</w:t>
+              <w:t>Parity Mode selection (0 = Even Parity, 1 = Odd Parity).</w:t>
             </w:r>
           </w:p>
         </w:tc>
@@ -22566,7 +22564,7 @@
                 <w:sz w:val="24"/>
                 <w:szCs w:val="32"/>
               </w:rPr>
-              <w:t>ADDR_MODE [16], DEV_COUNT [15:8], ENC_MODE [7:4], PARITY_MODE [3:2], SYS_STATE [1:0]</w:t>
+              <w:t>BASE_ADDR [31:16], DEV_COUNT [15:8], ENC_MODE [7:4], ADDR_MODE [3], PARITY_MODE [2], SYS_STATE [1:0]</w:t>
             </w:r>
           </w:p>
         </w:tc>
@@ -25223,7 +25221,7 @@
                 <w:sz w:val="24"/>
                 <w:szCs w:val="24"/>
               </w:rPr>
-              <w:t>2 bits</w:t>
+              <w:t>1 bit</w:t>
             </w:r>
           </w:p>
         </w:tc>
@@ -25553,7 +25551,7 @@
           <w:sz w:val="24"/>
           <w:szCs w:val="24"/>
         </w:rPr>
-        <w:t>PARITY_MODE is configured once by software during the Configuration phase and held in the Register File; the exact Even/Odd encoding of the 2-bit field is not enumerated in the current spec text and should be confirmed.</w:t>
+        <w:t>PARITY_MODE is configured once by software during the Configuration phase and held in the Register File. The field is a single bit: 0 = Even parity, 1 = Odd parity.</w:t>
       </w:r>
     </w:p>
     <w:p>
@@ -26323,7 +26321,7 @@
                 <w:sz w:val="24"/>
                 <w:szCs w:val="24"/>
               </w:rPr>
-              <w:t>Selects translation mode. Maps directly to Register File bit 16, ADDR_MODE (spec Section 5): 0 = Limit Address/Last Address mode, 1 = Region mode.</w:t>
+              <w:t>Selects translation mode. Maps directly to Register File bit 3, ADDR_MODE (spec Section 5): 0 = Limit Address/Last Address mode, 1 = Region mode.</w:t>
             </w:r>
           </w:p>
         </w:tc>
@@ -26447,6 +26445,48 @@
         </w:tc>
       </w:tr>
       <w:tr>
+        <w:tc>
+          <w:tcPr>
+            <w:tcW w:type="dxa" w:w="2200"/>
+          </w:tcPr>
+          <w:p>
+            <w:r>
+              <w:t>config_addr</w:t>
+            </w:r>
+          </w:p>
+        </w:tc>
+        <w:tc>
+          <w:tcPr>
+            <w:tcW w:type="dxa" w:w="1600"/>
+          </w:tcPr>
+          <w:p>
+            <w:r>
+              <w:t>Input</w:t>
+            </w:r>
+          </w:p>
+        </w:tc>
+        <w:tc>
+          <w:tcPr>
+            <w:tcW w:type="dxa" w:w="2200"/>
+          </w:tcPr>
+          <w:p>
+            <w:r>
+              <w:t>ADDR_WIDTH</w:t>
+            </w:r>
+          </w:p>
+        </w:tc>
+        <w:tc>
+          <w:tcPr>
+            <w:tcW w:type="dxa" w:w="4638"/>
+          </w:tcPr>
+          <w:p>
+            <w:r>
+              <w:t>Base address carried in the BASE_ADDR field of the Configuration TLP header. Latched during the Configuration phase and added to the incoming address during the Transfer phase, so the base address is programmed by software rather than hardcoded.</w:t>
+            </w:r>
+          </w:p>
+        </w:tc>
+      </w:tr>
+      <w:tr>
         <w:trPr>
           <w:trHeight w:val="588"/>
         </w:trPr>
@@ -26701,7 +26741,7 @@
           <w:sz w:val="24"/>
           <w:szCs w:val="24"/>
         </w:rPr>
-        <w:t>The address translation mode is selected by the ADDR_MODE configuration bit stored in the configuration register (Base Address 0x0000, bit 16). Device address information is obtained from the configuration entries stored in the CDM during the Configuration phase.</w:t>
+        <w:t>The address translation mode is selected by the ADDR_MODE configuration bit stored in the configuration register (Base Address 0x0000, bit 3). Device address information is obtained from the configuration entries stored in the CDM during the Configuration phase. The base address used for translation is not hardcoded in the design: it is supplied by software in the BASE_ADDR field [31:16] of the Configuration TLP header during the Configuration phase, and is latched by the ATU for use in the Transfer phase.</w:t>
       </w:r>
     </w:p>
     <w:p>
@@ -28542,7 +28582,7 @@
                 <w:sz w:val="24"/>
                 <w:szCs w:val="24"/>
               </w:rPr>
-              <w:t>2 bits</w:t>
+              <w:t>1 bit</w:t>
             </w:r>
           </w:p>
         </w:tc>

</xml_diff>